<commit_message>
docs(th1): ghi số PR #14 vào bảng Milestone TH1 (#13)
Co-Authored-By: Claude Opus 5.5 <noreply@anthropic.com>
</commit_message>
<xml_diff>
--- a/docs/TH1/BaoCao_TH1.docx
+++ b/docs/TH1/BaoCao_TH1.docx
@@ -3323,18 +3323,18 @@
               <w:pStyle w:val="Compact"/>
             </w:pPr>
             <w:r>
-              <w:t xml:space="preserve">PR của mục D</w:t>
-            </w:r>
-          </w:p>
-        </w:tc>
-        <w:tc>
-          <w:tcPr/>
-          <w:p>
-            <w:pPr>
-              <w:pStyle w:val="Compact"/>
-            </w:pPr>
-            <w:r>
-              <w:t xml:space="preserve">—</w:t>
+              <w:t xml:space="preserve">#14</w:t>
+            </w:r>
+          </w:p>
+        </w:tc>
+        <w:tc>
+          <w:tcPr/>
+          <w:p>
+            <w:pPr>
+              <w:pStyle w:val="Compact"/>
+            </w:pPr>
+            <w:r>
+              <w:t xml:space="preserve">xem PR</w:t>
             </w:r>
           </w:p>
         </w:tc>

</xml_diff>

<commit_message>
docs(th1): bổ sung bằng chứng IDE, ảnh git log, thông tin sinh viên và ý tưởng CR-01 (#13)
Co-Authored-By: Claude Opus 5.5 <noreply@anthropic.com>
</commit_message>
<xml_diff>
--- a/docs/TH1/BaoCao_TH1.docx
+++ b/docs/TH1/BaoCao_TH1.docx
@@ -158,7 +158,7 @@
               <w:pStyle w:val="Compact"/>
             </w:pPr>
             <w:r>
-              <w:t xml:space="preserve">[TÔI SẼ ĐIỀN: họ tên] — MSSV [TÔI SẼ ĐIỀN] — Lớp [TÔI SẼ ĐIỀN]</w:t>
+              <w:t xml:space="preserve">Nguyễn Thanh Hoàng — MSSV ____ — Lớp ____</w:t>
             </w:r>
           </w:p>
         </w:tc>
@@ -666,7 +666,7 @@
       </w:r>
     </w:p>
     <w:bookmarkEnd w:id="21"/>
-    <w:bookmarkStart w:id="28" w:name="repository-git-workflow-baseline"/>
+    <w:bookmarkStart w:id="31" w:name="repository-git-workflow-baseline"/>
     <w:p>
       <w:pPr>
         <w:pStyle w:val="Heading1"/>
@@ -3412,7 +3412,7 @@
       </w:tr>
     </w:tbl>
     <w:bookmarkEnd w:id="25"/>
-    <w:bookmarkStart w:id="26" w:name="kiểm-chứng-lịch-sử-main-sau-baseline"/>
+    <w:bookmarkStart w:id="29" w:name="kiểm-chứng-lịch-sử-main-sau-baseline"/>
     <w:p>
       <w:pPr>
         <w:pStyle w:val="Heading2"/>
@@ -3533,22 +3533,7 @@
         <w:pStyle w:val="FirstParagraph"/>
       </w:pPr>
       <w:r>
-        <w:t xml:space="preserve">Lệnh thứ nhất cho thấy, tính từ baseline,</w:t>
-      </w:r>
-      <w:r>
-        <w:t xml:space="preserve"> </w:t>
-      </w:r>
-      <w:r>
-        <w:rPr>
-          <w:rStyle w:val="VerbatimChar"/>
-        </w:rPr>
-        <w:t xml:space="preserve">main</w:t>
-      </w:r>
-      <w:r>
-        <w:t xml:space="preserve"> </w:t>
-      </w:r>
-      <w:r>
-        <w:t xml:space="preserve">chỉ tiến lên qua merge commit của PR. Lệnh thứ hai rỗng, nghĩa là</w:t>
+        <w:t xml:space="preserve">Ảnh chụp Terminal thật của hai lệnh trên, chụp</w:t>
       </w:r>
       <w:r>
         <w:t xml:space="preserve"> </w:t>
@@ -3558,29 +3543,123 @@
           <w:b/>
           <w:bCs/>
         </w:rPr>
-        <w:t xml:space="preserve">không có commit nào được đẩy thẳng vào</w:t>
+        <w:t xml:space="preserve">trước khi merge PR #14</w:t>
+      </w:r>
+      <w:r>
+        <w:t xml:space="preserve"> </w:t>
+      </w:r>
+      <w:r>
+        <w:t xml:space="preserve">(khớp bản text):</w:t>
+      </w:r>
+    </w:p>
+    <w:p>
+      <w:pPr>
+        <w:pStyle w:val="CaptionedFigure"/>
+      </w:pPr>
+      <w:r>
+        <w:drawing>
+          <wp:inline>
+            <wp:extent cx="5334000" cy="592335"/>
+            <wp:effectExtent b="0" l="0" r="0" t="0"/>
+            <wp:docPr descr="Hai lệnh git log trên origin/main trước khi merge PR #14" title="" id="27" name="Picture"/>
+            <a:graphic>
+              <a:graphicData uri="http://schemas.openxmlformats.org/drawingml/2006/picture">
+                <pic:pic>
+                  <pic:nvPicPr>
+                    <pic:cNvPr descr="evidence/git-log-first-parent.png" id="28" name="Picture"/>
+                    <pic:cNvPicPr>
+                      <a:picLocks noChangeArrowheads="1" noChangeAspect="1"/>
+                    </pic:cNvPicPr>
+                  </pic:nvPicPr>
+                  <pic:blipFill>
+                    <a:blip r:embed="rId26"/>
+                    <a:stretch>
+                      <a:fillRect/>
+                    </a:stretch>
+                  </pic:blipFill>
+                  <pic:spPr bwMode="auto">
+                    <a:xfrm>
+                      <a:off x="0" y="0"/>
+                      <a:ext cx="5334000" cy="592335"/>
+                    </a:xfrm>
+                    <a:prstGeom prst="rect">
+                      <a:avLst/>
+                    </a:prstGeom>
+                    <a:noFill/>
+                    <a:ln w="9525">
+                      <a:noFill/>
+                      <a:headEnd/>
+                      <a:tailEnd/>
+                    </a:ln>
+                  </pic:spPr>
+                </pic:pic>
+              </a:graphicData>
+            </a:graphic>
+          </wp:inline>
+        </w:drawing>
+      </w:r>
+    </w:p>
+    <w:p>
+      <w:pPr>
+        <w:pStyle w:val="ImageCaption"/>
+      </w:pPr>
+      <w:r>
+        <w:t xml:space="preserve">Hai lệnh git log trên origin/main trước khi merge PR #14</w:t>
+      </w:r>
+    </w:p>
+    <w:p>
+      <w:pPr>
+        <w:pStyle w:val="BodyText"/>
+      </w:pPr>
+      <w:r>
+        <w:t xml:space="preserve">Lệnh thứ nhất cho thấy, tính từ baseline,</w:t>
+      </w:r>
+      <w:r>
+        <w:t xml:space="preserve"> </w:t>
+      </w:r>
+      <w:r>
+        <w:rPr>
+          <w:rStyle w:val="VerbatimChar"/>
+        </w:rPr>
+        <w:t xml:space="preserve">main</w:t>
+      </w:r>
+      <w:r>
+        <w:t xml:space="preserve"> </w:t>
+      </w:r>
+      <w:r>
+        <w:t xml:space="preserve">chỉ tiến lên qua merge commit của PR. Lệnh thứ hai rỗng, nghĩa là</w:t>
+      </w:r>
+      <w:r>
+        <w:t xml:space="preserve"> </w:t>
       </w:r>
       <w:r>
         <w:rPr>
           <w:b/>
           <w:bCs/>
         </w:rPr>
-        <w:t xml:space="preserve"> </w:t>
-      </w:r>
-      <w:r>
-        <w:rPr>
-          <w:rStyle w:val="VerbatimChar"/>
+        <w:t xml:space="preserve">không có commit nào được đẩy thẳng vào</w:t>
+      </w:r>
+      <w:r>
+        <w:rPr>
           <w:b/>
           <w:bCs/>
         </w:rPr>
+        <w:t xml:space="preserve"> </w:t>
+      </w:r>
+      <w:r>
+        <w:rPr>
+          <w:rStyle w:val="VerbatimChar"/>
+          <w:b/>
+          <w:bCs/>
+        </w:rPr>
         <w:t xml:space="preserve">main</w:t>
       </w:r>
       <w:r>
         <w:t xml:space="preserve">.</w:t>
       </w:r>
     </w:p>
-    <w:bookmarkEnd w:id="26"/>
-    <w:bookmarkStart w:id="27" w:name="cấu-trúc-repository-và-.gitignore"/>
+    <w:bookmarkEnd w:id="29"/>
+    <w:bookmarkStart w:id="30" w:name="cấu-trúc-repository-và-.gitignore"/>
     <w:p>
       <w:pPr>
         <w:pStyle w:val="Heading2"/>
@@ -4546,9 +4625,9 @@
         <w:t xml:space="preserve">Mật khẩu và token SonarQube local không nằm trong repo.</w:t>
       </w:r>
     </w:p>
-    <w:bookmarkEnd w:id="27"/>
-    <w:bookmarkEnd w:id="28"/>
-    <w:bookmarkStart w:id="53" w:name="khảo-sát-hệ-thống"/>
+    <w:bookmarkEnd w:id="30"/>
+    <w:bookmarkEnd w:id="31"/>
+    <w:bookmarkStart w:id="63" w:name="khảo-sát-hệ-thống"/>
     <w:p>
       <w:pPr>
         <w:pStyle w:val="Heading1"/>
@@ -4557,7 +4636,7 @@
         <w:t xml:space="preserve">4. Khảo sát hệ thống</w:t>
       </w:r>
     </w:p>
-    <w:bookmarkStart w:id="29" w:name="kiến-trúc-tổng-quát"/>
+    <w:bookmarkStart w:id="32" w:name="kiến-trúc-tổng-quát"/>
     <w:p>
       <w:pPr>
         <w:pStyle w:val="Heading2"/>
@@ -4755,8 +4834,8 @@
         <w:t xml:space="preserve">) và hiển thị.</w:t>
       </w:r>
     </w:p>
-    <w:bookmarkEnd w:id="29"/>
-    <w:bookmarkStart w:id="33" w:name="X6ec46c6143172db25810cc92726bddf48438a0c"/>
+    <w:bookmarkEnd w:id="32"/>
+    <w:bookmarkStart w:id="36" w:name="X6ec46c6143172db25810cc92726bddf48438a0c"/>
     <w:p>
       <w:pPr>
         <w:pStyle w:val="Heading2"/>
@@ -4786,18 +4865,18 @@
           <wp:inline>
             <wp:extent cx="3370554" cy="7919999"/>
             <wp:effectExtent b="0" l="0" r="0" t="0"/>
-            <wp:docPr descr="" title="" id="31" name="Picture"/>
+            <wp:docPr descr="" title="" id="34" name="Picture"/>
             <a:graphic>
               <a:graphicData uri="http://schemas.openxmlformats.org/drawingml/2006/picture">
                 <pic:pic>
                   <pic:nvPicPr>
-                    <pic:cNvPr descr="diagrams/01-use-case.png" id="32" name="Picture"/>
+                    <pic:cNvPr descr="diagrams/01-use-case.png" id="35" name="Picture"/>
                     <pic:cNvPicPr>
                       <a:picLocks noChangeArrowheads="1" noChangeAspect="1"/>
                     </pic:cNvPicPr>
                   </pic:nvPicPr>
                   <pic:blipFill>
-                    <a:blip r:embed="rId30"/>
+                    <a:blip r:embed="rId33"/>
                     <a:stretch>
                       <a:fillRect/>
                     </a:stretch>
@@ -4824,8 +4903,8 @@
         </w:drawing>
       </w:r>
     </w:p>
-    <w:bookmarkEnd w:id="33"/>
-    <w:bookmarkStart w:id="37" w:name="X65aba9e333e32e61838f9c1649a6cf92306ddd6"/>
+    <w:bookmarkEnd w:id="36"/>
+    <w:bookmarkStart w:id="40" w:name="X65aba9e333e32e61838f9c1649a6cf92306ddd6"/>
     <w:p>
       <w:pPr>
         <w:pStyle w:val="Heading2"/>
@@ -4843,18 +4922,18 @@
           <wp:inline>
             <wp:extent cx="5334000" cy="6935834"/>
             <wp:effectExtent b="0" l="0" r="0" t="0"/>
-            <wp:docPr descr="" title="" id="35" name="Picture"/>
+            <wp:docPr descr="" title="" id="38" name="Picture"/>
             <a:graphic>
               <a:graphicData uri="http://schemas.openxmlformats.org/drawingml/2006/picture">
                 <pic:pic>
                   <pic:nvPicPr>
-                    <pic:cNvPr descr="diagrams/02-sequence-diem-danh-qr.png" id="36" name="Picture"/>
+                    <pic:cNvPr descr="diagrams/02-sequence-diem-danh-qr.png" id="39" name="Picture"/>
                     <pic:cNvPicPr>
                       <a:picLocks noChangeArrowheads="1" noChangeAspect="1"/>
                     </pic:cNvPicPr>
                   </pic:nvPicPr>
                   <pic:blipFill>
-                    <a:blip r:embed="rId34"/>
+                    <a:blip r:embed="rId37"/>
                     <a:stretch>
                       <a:fillRect/>
                     </a:stretch>
@@ -5366,8 +5445,8 @@
         </w:tc>
       </w:tr>
     </w:tbl>
-    <w:bookmarkEnd w:id="37"/>
-    <w:bookmarkStart w:id="47" w:name="erd-dựng-từ-migrations-trên-main"/>
+    <w:bookmarkEnd w:id="40"/>
+    <w:bookmarkStart w:id="50" w:name="erd-dựng-từ-migrations-trên-main"/>
     <w:p>
       <w:pPr>
         <w:pStyle w:val="Heading2"/>
@@ -5629,18 +5708,18 @@
           <wp:inline>
             <wp:extent cx="5334000" cy="4028538"/>
             <wp:effectExtent b="0" l="0" r="0" t="0"/>
-            <wp:docPr descr="" title="" id="39" name="Picture"/>
+            <wp:docPr descr="" title="" id="42" name="Picture"/>
             <a:graphic>
               <a:graphicData uri="http://schemas.openxmlformats.org/drawingml/2006/picture">
                 <pic:pic>
                   <pic:nvPicPr>
-                    <pic:cNvPr descr="diagrams/03-erd-tai-khoan-to-chuc.png" id="40" name="Picture"/>
+                    <pic:cNvPr descr="diagrams/03-erd-tai-khoan-to-chuc.png" id="43" name="Picture"/>
                     <pic:cNvPicPr>
                       <a:picLocks noChangeArrowheads="1" noChangeAspect="1"/>
                     </pic:cNvPicPr>
                   </pic:nvPicPr>
                   <pic:blipFill>
-                    <a:blip r:embed="rId38"/>
+                    <a:blip r:embed="rId41"/>
                     <a:stretch>
                       <a:fillRect/>
                     </a:stretch>
@@ -5688,18 +5767,18 @@
           <wp:inline>
             <wp:extent cx="5334000" cy="3627876"/>
             <wp:effectExtent b="0" l="0" r="0" t="0"/>
-            <wp:docPr descr="" title="" id="42" name="Picture"/>
+            <wp:docPr descr="" title="" id="45" name="Picture"/>
             <a:graphic>
               <a:graphicData uri="http://schemas.openxmlformats.org/drawingml/2006/picture">
                 <pic:pic>
                   <pic:nvPicPr>
-                    <pic:cNvPr descr="diagrams/04-erd-doan-vien-bieu-mau.png" id="43" name="Picture"/>
+                    <pic:cNvPr descr="diagrams/04-erd-doan-vien-bieu-mau.png" id="46" name="Picture"/>
                     <pic:cNvPicPr>
                       <a:picLocks noChangeArrowheads="1" noChangeAspect="1"/>
                     </pic:cNvPicPr>
                   </pic:nvPicPr>
                   <pic:blipFill>
-                    <a:blip r:embed="rId41"/>
+                    <a:blip r:embed="rId44"/>
                     <a:stretch>
                       <a:fillRect/>
                     </a:stretch>
@@ -5747,18 +5826,18 @@
           <wp:inline>
             <wp:extent cx="5334000" cy="5104086"/>
             <wp:effectExtent b="0" l="0" r="0" t="0"/>
-            <wp:docPr descr="" title="" id="45" name="Picture"/>
+            <wp:docPr descr="" title="" id="48" name="Picture"/>
             <a:graphic>
               <a:graphicData uri="http://schemas.openxmlformats.org/drawingml/2006/picture">
                 <pic:pic>
                   <pic:nvPicPr>
-                    <pic:cNvPr descr="diagrams/05-erd-chuong-trinh-diem-danh.png" id="46" name="Picture"/>
+                    <pic:cNvPr descr="diagrams/05-erd-chuong-trinh-diem-danh.png" id="49" name="Picture"/>
                     <pic:cNvPicPr>
                       <a:picLocks noChangeArrowheads="1" noChangeAspect="1"/>
                     </pic:cNvPicPr>
                   </pic:nvPicPr>
                   <pic:blipFill>
-                    <a:blip r:embed="rId44"/>
+                    <a:blip r:embed="rId47"/>
                     <a:stretch>
                       <a:fillRect/>
                     </a:stretch>
@@ -6619,8 +6698,8 @@
         <w:t xml:space="preserve">. Hai tên dễ nhầm khi bảo trì.</w:t>
       </w:r>
     </w:p>
-    <w:bookmarkEnd w:id="47"/>
-    <w:bookmarkStart w:id="51" w:name="sơ-đồ-module-dependency"/>
+    <w:bookmarkEnd w:id="50"/>
+    <w:bookmarkStart w:id="54" w:name="sơ-đồ-module-dependency"/>
     <w:p>
       <w:pPr>
         <w:pStyle w:val="Heading2"/>
@@ -6676,18 +6755,18 @@
           <wp:inline>
             <wp:extent cx="5334000" cy="5560899"/>
             <wp:effectExtent b="0" l="0" r="0" t="0"/>
-            <wp:docPr descr="" title="" id="49" name="Picture"/>
+            <wp:docPr descr="" title="" id="52" name="Picture"/>
             <a:graphic>
               <a:graphicData uri="http://schemas.openxmlformats.org/drawingml/2006/picture">
                 <pic:pic>
                   <pic:nvPicPr>
-                    <pic:cNvPr descr="diagrams/06-module-dependency.png" id="50" name="Picture"/>
+                    <pic:cNvPr descr="diagrams/06-module-dependency.png" id="53" name="Picture"/>
                     <pic:cNvPicPr>
                       <a:picLocks noChangeArrowheads="1" noChangeAspect="1"/>
                     </pic:cNvPicPr>
                   </pic:nvPicPr>
                   <pic:blipFill>
-                    <a:blip r:embed="rId48"/>
+                    <a:blip r:embed="rId51"/>
                     <a:stretch>
                       <a:fillRect/>
                     </a:stretch>
@@ -7125,8 +7204,8 @@
         <w:t xml:space="preserve">: các tầng không phụ thuộc vòng.</w:t>
       </w:r>
     </w:p>
-    <w:bookmarkEnd w:id="51"/>
-    <w:bookmarkStart w:id="52" w:name="lịch-sử-một-file-quan-trọng"/>
+    <w:bookmarkEnd w:id="54"/>
+    <w:bookmarkStart w:id="55" w:name="lịch-sử-một-file-quan-trọng"/>
     <w:p>
       <w:pPr>
         <w:pStyle w:val="Heading2"/>
@@ -7258,9 +7337,344 @@
         <w:t xml:space="preserve">nhưng không giữ query string khi chuyển hướng, và đó là nguồn gốc của K1.</w:t>
       </w:r>
     </w:p>
-    <w:bookmarkEnd w:id="52"/>
-    <w:bookmarkEnd w:id="53"/>
-    <w:bookmarkStart w:id="66" w:name="đánh-giá-khả-năng-bảo-trì"/>
+    <w:bookmarkEnd w:id="55"/>
+    <w:bookmarkStart w:id="62" w:name="bằng-chứng-từ-ide-rider"/>
+    <w:p>
+      <w:pPr>
+        <w:pStyle w:val="Heading2"/>
+      </w:pPr>
+      <w:r>
+        <w:t xml:space="preserve">4.7 Bằng chứng từ IDE (Rider)</w:t>
+      </w:r>
+    </w:p>
+    <w:p>
+      <w:pPr>
+        <w:pStyle w:val="FirstParagraph"/>
+      </w:pPr>
+      <w:r>
+        <w:rPr>
+          <w:b/>
+          <w:bCs/>
+        </w:rPr>
+        <w:t xml:space="preserve">Find Usages</w:t>
+      </w:r>
+      <w:r>
+        <w:rPr>
+          <w:b/>
+          <w:bCs/>
+        </w:rPr>
+        <w:t xml:space="preserve"> </w:t>
+      </w:r>
+      <w:r>
+        <w:rPr>
+          <w:rStyle w:val="VerbatimChar"/>
+          <w:b/>
+          <w:bCs/>
+        </w:rPr>
+        <w:t xml:space="preserve">requireUser()</w:t>
+      </w:r>
+      <w:r>
+        <w:rPr>
+          <w:b/>
+          <w:bCs/>
+        </w:rPr>
+        <w:t xml:space="preserve">.</w:t>
+      </w:r>
+      <w:r>
+        <w:t xml:space="preserve"> </w:t>
+      </w:r>
+      <w:r>
+        <w:t xml:space="preserve">Rider tìm được 101 usages: 99 trong</w:t>
+      </w:r>
+      <w:r>
+        <w:t xml:space="preserve"> </w:t>
+      </w:r>
+      <w:r>
+        <w:rPr>
+          <w:rStyle w:val="VerbatimChar"/>
+        </w:rPr>
+        <w:t xml:space="preserve">src/app</w:t>
+      </w:r>
+      <w:r>
+        <w:t xml:space="preserve">, trong đó 95 ở</w:t>
+      </w:r>
+      <w:r>
+        <w:t xml:space="preserve"> </w:t>
+      </w:r>
+      <w:r>
+        <w:rPr>
+          <w:rStyle w:val="VerbatimChar"/>
+        </w:rPr>
+        <w:t xml:space="preserve">src/app/api</w:t>
+      </w:r>
+      <w:r>
+        <w:t xml:space="preserve">. Gần như mọi route handler đều đi qua</w:t>
+      </w:r>
+      <w:r>
+        <w:t xml:space="preserve"> </w:t>
+      </w:r>
+      <w:r>
+        <w:rPr>
+          <w:rStyle w:val="VerbatimChar"/>
+        </w:rPr>
+        <w:t xml:space="preserve">lib/auth</w:t>
+      </w:r>
+      <w:r>
+        <w:t xml:space="preserve">, đúng như sơ đồ 4.5:</w:t>
+      </w:r>
+      <w:r>
+        <w:t xml:space="preserve"> </w:t>
+      </w:r>
+      <w:r>
+        <w:rPr>
+          <w:rStyle w:val="VerbatimChar"/>
+        </w:rPr>
+        <w:t xml:space="preserve">lib/auth</w:t>
+      </w:r>
+      <w:r>
+        <w:t xml:space="preserve"> </w:t>
+      </w:r>
+      <w:r>
+        <w:t xml:space="preserve">là điểm phụ thuộc tập trung, sửa chữ ký hàm này sẽ ảnh hưởng toàn bộ tầng API.</w:t>
+      </w:r>
+    </w:p>
+    <w:p>
+      <w:pPr>
+        <w:pStyle w:val="CaptionedFigure"/>
+      </w:pPr>
+      <w:r>
+        <w:drawing>
+          <wp:inline>
+            <wp:extent cx="5334000" cy="3053953"/>
+            <wp:effectExtent b="0" l="0" r="0" t="0"/>
+            <wp:docPr descr="Find Usages requireUser() trong Rider: 101 usages" title="" id="57" name="Picture"/>
+            <a:graphic>
+              <a:graphicData uri="http://schemas.openxmlformats.org/drawingml/2006/picture">
+                <pic:pic>
+                  <pic:nvPicPr>
+                    <pic:cNvPr descr="evidence/ide/find-usages-requireUser.png" id="58" name="Picture"/>
+                    <pic:cNvPicPr>
+                      <a:picLocks noChangeArrowheads="1" noChangeAspect="1"/>
+                    </pic:cNvPicPr>
+                  </pic:nvPicPr>
+                  <pic:blipFill>
+                    <a:blip r:embed="rId56"/>
+                    <a:stretch>
+                      <a:fillRect/>
+                    </a:stretch>
+                  </pic:blipFill>
+                  <pic:spPr bwMode="auto">
+                    <a:xfrm>
+                      <a:off x="0" y="0"/>
+                      <a:ext cx="5334000" cy="3053953"/>
+                    </a:xfrm>
+                    <a:prstGeom prst="rect">
+                      <a:avLst/>
+                    </a:prstGeom>
+                    <a:noFill/>
+                    <a:ln w="9525">
+                      <a:noFill/>
+                      <a:headEnd/>
+                      <a:tailEnd/>
+                    </a:ln>
+                  </pic:spPr>
+                </pic:pic>
+              </a:graphicData>
+            </a:graphic>
+          </wp:inline>
+        </w:drawing>
+      </w:r>
+    </w:p>
+    <w:p>
+      <w:pPr>
+        <w:pStyle w:val="ImageCaption"/>
+      </w:pPr>
+      <w:r>
+        <w:t xml:space="preserve">Find Usages requireUser() trong Rider: 101 usages</w:t>
+      </w:r>
+    </w:p>
+    <w:p>
+      <w:pPr>
+        <w:pStyle w:val="BodyText"/>
+      </w:pPr>
+      <w:r>
+        <w:rPr>
+          <w:b/>
+          <w:bCs/>
+        </w:rPr>
+        <w:t xml:space="preserve">Call Hierarchy</w:t>
+      </w:r>
+      <w:r>
+        <w:rPr>
+          <w:b/>
+          <w:bCs/>
+        </w:rPr>
+        <w:t xml:space="preserve"> </w:t>
+      </w:r>
+      <w:r>
+        <w:rPr>
+          <w:b/>
+          <w:bCs/>
+        </w:rPr>
+        <w:t xml:space="preserve">“Callers of</w:t>
+      </w:r>
+      <w:r>
+        <w:rPr>
+          <w:b/>
+          <w:bCs/>
+        </w:rPr>
+        <w:t xml:space="preserve"> </w:t>
+      </w:r>
+      <w:r>
+        <w:rPr>
+          <w:rStyle w:val="VerbatimChar"/>
+          <w:b/>
+          <w:bCs/>
+        </w:rPr>
+        <w:t xml:space="preserve">attendanceRpcError</w:t>
+      </w:r>
+      <w:r>
+        <w:rPr>
+          <w:b/>
+          <w:bCs/>
+        </w:rPr>
+        <w:t xml:space="preserve">”</w:t>
+      </w:r>
+      <w:r>
+        <w:rPr>
+          <w:b/>
+          <w:bCs/>
+        </w:rPr>
+        <w:t xml:space="preserve">.</w:t>
+      </w:r>
+      <w:r>
+        <w:t xml:space="preserve"> </w:t>
+      </w:r>
+      <w:r>
+        <w:t xml:space="preserve">Hàm được gọi từ 4 route handler:</w:t>
+      </w:r>
+      <w:r>
+        <w:t xml:space="preserve"> </w:t>
+      </w:r>
+      <w:r>
+        <w:rPr>
+          <w:rStyle w:val="VerbatimChar"/>
+        </w:rPr>
+        <w:t xml:space="preserve">POST check-in</w:t>
+      </w:r>
+      <w:r>
+        <w:t xml:space="preserve">,</w:t>
+      </w:r>
+      <w:r>
+        <w:t xml:space="preserve"> </w:t>
+      </w:r>
+      <w:r>
+        <w:rPr>
+          <w:rStyle w:val="VerbatimChar"/>
+        </w:rPr>
+        <w:t xml:space="preserve">POST sessions/[sessionId]/status</w:t>
+      </w:r>
+      <w:r>
+        <w:t xml:space="preserve">,</w:t>
+      </w:r>
+      <w:r>
+        <w:t xml:space="preserve"> </w:t>
+      </w:r>
+      <w:r>
+        <w:rPr>
+          <w:rStyle w:val="VerbatimChar"/>
+        </w:rPr>
+        <w:t xml:space="preserve">POST sessions/[sessionId]/qr</w:t>
+      </w:r>
+      <w:r>
+        <w:t xml:space="preserve">,</w:t>
+      </w:r>
+      <w:r>
+        <w:t xml:space="preserve"> </w:t>
+      </w:r>
+      <w:r>
+        <w:rPr>
+          <w:rStyle w:val="VerbatimChar"/>
+        </w:rPr>
+        <w:t xml:space="preserve">PUT event-programs/[id]/attendance</w:t>
+      </w:r>
+      <w:r>
+        <w:t xml:space="preserve">, cùng với test. Đây là bước cuối của sequence 4.3 (RPC lỗi → ánh xạ mã lỗi → HTTP), và cũng là phạm vi chịu ảnh hưởng của finding F2: ánh xạ</w:t>
+      </w:r>
+      <w:r>
+        <w:t xml:space="preserve"> </w:t>
+      </w:r>
+      <w:r>
+        <w:rPr>
+          <w:rStyle w:val="VerbatimChar"/>
+        </w:rPr>
+        <w:t xml:space="preserve">message.includes</w:t>
+      </w:r>
+      <w:r>
+        <w:t xml:space="preserve"> </w:t>
+      </w:r>
+      <w:r>
+        <w:t xml:space="preserve">sai thứ tự sẽ trả mã sai ở cả 4 route.</w:t>
+      </w:r>
+    </w:p>
+    <w:p>
+      <w:pPr>
+        <w:pStyle w:val="CaptionedFigure"/>
+      </w:pPr>
+      <w:r>
+        <w:drawing>
+          <wp:inline>
+            <wp:extent cx="5334000" cy="3053953"/>
+            <wp:effectExtent b="0" l="0" r="0" t="0"/>
+            <wp:docPr descr="Call Hierarchy attendanceRpcError trong Rider: 4 route handler và test" title="" id="60" name="Picture"/>
+            <a:graphic>
+              <a:graphicData uri="http://schemas.openxmlformats.org/drawingml/2006/picture">
+                <pic:pic>
+                  <pic:nvPicPr>
+                    <pic:cNvPr descr="evidence/ide/call-hierarchy-attendanceRpcError.png" id="61" name="Picture"/>
+                    <pic:cNvPicPr>
+                      <a:picLocks noChangeArrowheads="1" noChangeAspect="1"/>
+                    </pic:cNvPicPr>
+                  </pic:nvPicPr>
+                  <pic:blipFill>
+                    <a:blip r:embed="rId59"/>
+                    <a:stretch>
+                      <a:fillRect/>
+                    </a:stretch>
+                  </pic:blipFill>
+                  <pic:spPr bwMode="auto">
+                    <a:xfrm>
+                      <a:off x="0" y="0"/>
+                      <a:ext cx="5334000" cy="3053953"/>
+                    </a:xfrm>
+                    <a:prstGeom prst="rect">
+                      <a:avLst/>
+                    </a:prstGeom>
+                    <a:noFill/>
+                    <a:ln w="9525">
+                      <a:noFill/>
+                      <a:headEnd/>
+                      <a:tailEnd/>
+                    </a:ln>
+                  </pic:spPr>
+                </pic:pic>
+              </a:graphicData>
+            </a:graphic>
+          </wp:inline>
+        </w:drawing>
+      </w:r>
+    </w:p>
+    <w:p>
+      <w:pPr>
+        <w:pStyle w:val="ImageCaption"/>
+      </w:pPr>
+      <w:r>
+        <w:t xml:space="preserve">Call Hierarchy attendanceRpcError trong Rider: 4 route handler và test</w:t>
+      </w:r>
+    </w:p>
+    <w:bookmarkEnd w:id="62"/>
+    <w:bookmarkEnd w:id="63"/>
+    <w:bookmarkStart w:id="76" w:name="đánh-giá-khả-năng-bảo-trì"/>
     <w:p>
       <w:pPr>
         <w:pStyle w:val="Heading1"/>
@@ -7269,7 +7683,7 @@
         <w:t xml:space="preserve">5. Đánh giá khả năng bảo trì</w:t>
       </w:r>
     </w:p>
-    <w:bookmarkStart w:id="63" w:name="sonarqube-community-docker"/>
+    <w:bookmarkStart w:id="73" w:name="sonarqube-community-docker"/>
     <w:p>
       <w:pPr>
         <w:pStyle w:val="Heading2"/>
@@ -7705,18 +8119,18 @@
           <wp:inline>
             <wp:extent cx="5334000" cy="3704166"/>
             <wp:effectExtent b="0" l="0" r="0" t="0"/>
-            <wp:docPr descr="SonarQube — tổng quan" title="" id="55" name="Picture"/>
+            <wp:docPr descr="SonarQube — tổng quan" title="" id="65" name="Picture"/>
             <a:graphic>
               <a:graphicData uri="http://schemas.openxmlformats.org/drawingml/2006/picture">
                 <pic:pic>
                   <pic:nvPicPr>
-                    <pic:cNvPr descr="evidence/sonarqube/sonar-overview.png" id="56" name="Picture"/>
+                    <pic:cNvPr descr="evidence/sonarqube/sonar-overview.png" id="66" name="Picture"/>
                     <pic:cNvPicPr>
                       <a:picLocks noChangeArrowheads="1" noChangeAspect="1"/>
                     </pic:cNvPicPr>
                   </pic:nvPicPr>
                   <pic:blipFill>
-                    <a:blip r:embed="rId54"/>
+                    <a:blip r:embed="rId64"/>
                     <a:stretch>
                       <a:fillRect/>
                     </a:stretch>
@@ -7760,18 +8174,18 @@
           <wp:inline>
             <wp:extent cx="5334000" cy="3704166"/>
             <wp:effectExtent b="0" l="0" r="0" t="0"/>
-            <wp:docPr descr="SonarQube — danh sách issue" title="" id="58" name="Picture"/>
+            <wp:docPr descr="SonarQube — danh sách issue" title="" id="68" name="Picture"/>
             <a:graphic>
               <a:graphicData uri="http://schemas.openxmlformats.org/drawingml/2006/picture">
                 <pic:pic>
                   <pic:nvPicPr>
-                    <pic:cNvPr descr="evidence/sonarqube/sonar-issues.png" id="59" name="Picture"/>
+                    <pic:cNvPr descr="evidence/sonarqube/sonar-issues.png" id="69" name="Picture"/>
                     <pic:cNvPicPr>
                       <a:picLocks noChangeArrowheads="1" noChangeAspect="1"/>
                     </pic:cNvPicPr>
                   </pic:nvPicPr>
                   <pic:blipFill>
-                    <a:blip r:embed="rId57"/>
+                    <a:blip r:embed="rId67"/>
                     <a:stretch>
                       <a:fillRect/>
                     </a:stretch>
@@ -7815,18 +8229,18 @@
           <wp:inline>
             <wp:extent cx="5334000" cy="3704166"/>
             <wp:effectExtent b="0" l="0" r="0" t="0"/>
-            <wp:docPr descr="SonarQube — cognitive complexity theo file" title="" id="61" name="Picture"/>
+            <wp:docPr descr="SonarQube — cognitive complexity theo file" title="" id="71" name="Picture"/>
             <a:graphic>
               <a:graphicData uri="http://schemas.openxmlformats.org/drawingml/2006/picture">
                 <pic:pic>
                   <pic:nvPicPr>
-                    <pic:cNvPr descr="evidence/sonarqube/sonar-measures-complexity.png" id="62" name="Picture"/>
+                    <pic:cNvPr descr="evidence/sonarqube/sonar-measures-complexity.png" id="72" name="Picture"/>
                     <pic:cNvPicPr>
                       <a:picLocks noChangeArrowheads="1" noChangeAspect="1"/>
                     </pic:cNvPicPr>
                   </pic:nvPicPr>
                   <pic:blipFill>
-                    <a:blip r:embed="rId60"/>
+                    <a:blip r:embed="rId70"/>
                     <a:stretch>
                       <a:fillRect/>
                     </a:stretch>
@@ -7967,8 +8381,8 @@
         <w:t xml:space="preserve">, SonarQube chỉ đo được phần TypeScript. Khoảng 9.000 dòng SQL chứa phần lớn nghiệp vụ nằm ngoài phân tích tĩnh, và hiện chỉ được bảo vệ bằng pgTAP (mục 6).</w:t>
       </w:r>
     </w:p>
-    <w:bookmarkEnd w:id="63"/>
-    <w:bookmarkStart w:id="64" w:name="phân-tích-các-finding-được-chọn"/>
+    <w:bookmarkEnd w:id="73"/>
+    <w:bookmarkStart w:id="74" w:name="phân-tích-các-finding-được-chọn"/>
     <w:p>
       <w:pPr>
         <w:pStyle w:val="Heading2"/>
@@ -9801,8 +10215,8 @@
         <w:t xml:space="preserve">): đây là mẫu email Auth, không phải trang web, nên là cảnh báo không áp dụng (false positive).</w:t>
       </w:r>
     </w:p>
-    <w:bookmarkEnd w:id="64"/>
-    <w:bookmarkStart w:id="65" w:name="nhận-xét-bảo-trì-khác"/>
+    <w:bookmarkEnd w:id="74"/>
+    <w:bookmarkStart w:id="75" w:name="nhận-xét-bảo-trì-khác"/>
     <w:p>
       <w:pPr>
         <w:pStyle w:val="Heading2"/>
@@ -10001,9 +10415,9 @@
         <w:t xml:space="preserve">.</w:t>
       </w:r>
     </w:p>
-    <w:bookmarkEnd w:id="65"/>
-    <w:bookmarkEnd w:id="66"/>
-    <w:bookmarkStart w:id="71" w:name="baseline-kiểm-thử-và-coverage"/>
+    <w:bookmarkEnd w:id="75"/>
+    <w:bookmarkEnd w:id="76"/>
+    <w:bookmarkStart w:id="81" w:name="baseline-kiểm-thử-và-coverage"/>
     <w:p>
       <w:pPr>
         <w:pStyle w:val="Heading1"/>
@@ -10012,7 +10426,7 @@
         <w:t xml:space="preserve">6. Baseline kiểm thử và coverage</w:t>
       </w:r>
     </w:p>
-    <w:bookmarkStart w:id="67" w:name="bộ-kiểm-thử-hiện-có"/>
+    <w:bookmarkStart w:id="77" w:name="bộ-kiểm-thử-hiện-có"/>
     <w:p>
       <w:pPr>
         <w:pStyle w:val="Heading2"/>
@@ -10527,8 +10941,8 @@
         </w:tc>
       </w:tr>
     </w:tbl>
-    <w:bookmarkEnd w:id="67"/>
-    <w:bookmarkStart w:id="68" w:name="bổ-sung-trong-th1-pr-12-issue-11"/>
+    <w:bookmarkEnd w:id="77"/>
+    <w:bookmarkStart w:id="78" w:name="bổ-sung-trong-th1-pr-12-issue-11"/>
     <w:p>
       <w:pPr>
         <w:pStyle w:val="Heading2"/>
@@ -11055,8 +11469,8 @@
         <w:t xml:space="preserve">).</w:t>
       </w:r>
     </w:p>
-    <w:bookmarkEnd w:id="68"/>
-    <w:bookmarkStart w:id="69" w:name="kết-quả-coverage-vitest-v8"/>
+    <w:bookmarkEnd w:id="78"/>
+    <w:bookmarkStart w:id="79" w:name="kết-quả-coverage-vitest-v8"/>
     <w:p>
       <w:pPr>
         <w:pStyle w:val="Heading2"/>
@@ -11821,8 +12235,8 @@
         <w:t xml:space="preserve">, nhưng v8 coverage không đo được. Vì vậy baseline kiểm thử phải báo cáo cả hai số: coverage Vitest và số assertion pgTAP.</w:t>
       </w:r>
     </w:p>
-    <w:bookmarkEnd w:id="69"/>
-    <w:bookmarkStart w:id="70" w:name="X6cbed6f1360d91226bdd4da519d100c5b4bf26d"/>
+    <w:bookmarkEnd w:id="79"/>
+    <w:bookmarkStart w:id="80" w:name="X6cbed6f1360d91226bdd4da519d100c5b4bf26d"/>
     <w:p>
       <w:pPr>
         <w:pStyle w:val="Heading2"/>
@@ -12552,9 +12966,9 @@
         <w:t xml:space="preserve">Ưu tiên đưa pgTAP lên CI (K3) để thay đổi SQL của CR được kiểm tra trên mỗi PR.</w:t>
       </w:r>
     </w:p>
-    <w:bookmarkEnd w:id="70"/>
-    <w:bookmarkEnd w:id="71"/>
-    <w:bookmarkStart w:id="72" w:name="vấn-đề-gặp-phải-và-cách-xử-lý"/>
+    <w:bookmarkEnd w:id="80"/>
+    <w:bookmarkEnd w:id="81"/>
+    <w:bookmarkStart w:id="82" w:name="vấn-đề-gặp-phải-và-cách-xử-lý"/>
     <w:p>
       <w:pPr>
         <w:pStyle w:val="Heading1"/>
@@ -13573,8 +13987,8 @@
         <w:t xml:space="preserve">Sinh viên đọc lại báo cáo trước khi merge PR mục D.</w:t>
       </w:r>
     </w:p>
-    <w:bookmarkEnd w:id="72"/>
-    <w:bookmarkStart w:id="73" w:name="nhận-xét-kết-luận-và-ý-tưởng-cr-01"/>
+    <w:bookmarkEnd w:id="82"/>
+    <w:bookmarkStart w:id="83" w:name="nhận-xét-kết-luận-và-ý-tưởng-cr-01"/>
     <w:p>
       <w:pPr>
         <w:pStyle w:val="Heading1"/>
@@ -13910,10 +14324,10 @@
         <w:t xml:space="preserve"> </w:t>
       </w:r>
       <w:r>
-        <w:t xml:space="preserve">[TÔI SẼ ĐIỀN]</w:t>
-      </w:r>
-    </w:p>
-    <w:bookmarkEnd w:id="73"/>
+        <w:t xml:space="preserve">CR-01 dự kiến theo hướng kỹ thuật nâng cao: bổ sung thông báo real-time trong ứng dụng (Supabase Realtime) khi kế hoạch chương trình được Văn phòng duyệt hoặc trả sửa và khi kết quả đăng ký của sinh viên thay đổi, thay cho việc người dùng phải tự tải lại trang để kiểm tra.</w:t>
+      </w:r>
+    </w:p>
+    <w:bookmarkEnd w:id="83"/>
     <w:sectPr>
       <w:footnotePr>
         <w:numRestart w:val="eachSect"/>

</xml_diff>

<commit_message>
docs(th1): điền MSSV, lớp và cập nhật trạng thái PR #14 trong báo cáo (#15)
Co-Authored-By: Claude Opus 5.5 <noreply@anthropic.com>
</commit_message>
<xml_diff>
--- a/docs/TH1/BaoCao_TH1.docx
+++ b/docs/TH1/BaoCao_TH1.docx
@@ -158,7 +158,7 @@
               <w:pStyle w:val="Compact"/>
             </w:pPr>
             <w:r>
-              <w:t xml:space="preserve">Nguyễn Thanh Hoàng — MSSV ____ — Lớp ____</w:t>
+              <w:t xml:space="preserve">Nguyễn Thanh Hoàng — MSSV 2211110012 — Lớp TH22DH-CN1</w:t>
             </w:r>
           </w:p>
         </w:tc>
@@ -3394,18 +3394,27 @@
               <w:pStyle w:val="Compact"/>
             </w:pPr>
             <w:r>
-              <w:t xml:space="preserve">xem PR</w:t>
-            </w:r>
-          </w:p>
-        </w:tc>
-        <w:tc>
-          <w:tcPr/>
-          <w:p>
-            <w:pPr>
-              <w:pStyle w:val="Compact"/>
-            </w:pPr>
-            <w:r>
-              <w:t xml:space="preserve">Chờ sinh viên đọc lại rồi mới merge</w:t>
+              <w:t xml:space="preserve">quality: pass (1m20s)</w:t>
+            </w:r>
+          </w:p>
+        </w:tc>
+        <w:tc>
+          <w:tcPr/>
+          <w:p>
+            <w:pPr>
+              <w:pStyle w:val="Compact"/>
+            </w:pPr>
+            <w:r>
+              <w:t xml:space="preserve">Đã merge</w:t>
+            </w:r>
+            <w:r>
+              <w:t xml:space="preserve"> </w:t>
+            </w:r>
+            <w:r>
+              <w:rPr>
+                <w:rStyle w:val="VerbatimChar"/>
+              </w:rPr>
+              <w:t xml:space="preserve">6467a31</w:t>
             </w:r>
           </w:p>
         </w:tc>

</xml_diff>

<commit_message>
docs(th1): bổ sung PR sửa giao diện, known issues K6–K9 từ kiểm thử tay, ảnh trước/sau (#19)
Co-Authored-By: Claude Opus 5.5 <noreply@anthropic.com>
</commit_message>
<xml_diff>
--- a/docs/TH1/BaoCao_TH1.docx
+++ b/docs/TH1/BaoCao_TH1.docx
@@ -2100,13 +2100,33 @@
       </w:r>
     </w:p>
     <w:bookmarkEnd w:id="23"/>
-    <w:bookmarkStart w:id="24" w:name="Xd412984e9d53be9b1378c8337d51ed12a70b218"/>
+    <w:bookmarkStart w:id="24" w:name="known-issues"/>
     <w:p>
       <w:pPr>
         <w:pStyle w:val="Heading2"/>
       </w:pPr>
       <w:r>
-        <w:t xml:space="preserve">3.3 Known issues tại baseline (chưa sửa trong TH1)</w:t>
+        <w:t xml:space="preserve">3.3 Known issues</w:t>
+      </w:r>
+    </w:p>
+    <w:p>
+      <w:pPr>
+        <w:pStyle w:val="FirstParagraph"/>
+      </w:pPr>
+      <w:r>
+        <w:t xml:space="preserve">K1–K5 có từ baseline. K6–K9 phát hiện sau, khi kiểm thử tay giao diện (ngày 19–20/10/2026). Cột</w:t>
+      </w:r>
+      <w:r>
+        <w:t xml:space="preserve"> </w:t>
+      </w:r>
+      <w:r>
+        <w:t xml:space="preserve">“Ảnh hưởng”</w:t>
+      </w:r>
+      <w:r>
+        <w:t xml:space="preserve"> </w:t>
+      </w:r>
+      <w:r>
+        <w:t xml:space="preserve">ghi rõ lỗi nào đã xử lý và ở PR nào.</w:t>
       </w:r>
     </w:p>
     <w:tbl>
@@ -2576,6 +2596,468 @@
             </w:r>
             <w:r>
               <w:t xml:space="preserve">(PR #10)</w:t>
+            </w:r>
+          </w:p>
+        </w:tc>
+      </w:tr>
+      <w:tr>
+        <w:tc>
+          <w:tcPr/>
+          <w:p>
+            <w:pPr>
+              <w:pStyle w:val="Compact"/>
+            </w:pPr>
+            <w:r>
+              <w:t xml:space="preserve">K6</w:t>
+            </w:r>
+          </w:p>
+        </w:tc>
+        <w:tc>
+          <w:tcPr/>
+          <w:p>
+            <w:pPr>
+              <w:pStyle w:val="Compact"/>
+            </w:pPr>
+            <w:r>
+              <w:rPr>
+                <w:b/>
+                <w:bCs/>
+              </w:rPr>
+              <w:t xml:space="preserve">Radio/checkbox ở trang điền biểu mẫu</w:t>
+            </w:r>
+            <w:r>
+              <w:t xml:space="preserve"> </w:t>
+            </w:r>
+            <w:r>
+              <w:t xml:space="preserve">bị kéo giãn hết bề ngang, nhãn bị đẩy sang mép phải</w:t>
+            </w:r>
+          </w:p>
+        </w:tc>
+        <w:tc>
+          <w:tcPr/>
+          <w:p>
+            <w:pPr>
+              <w:pStyle w:val="Compact"/>
+            </w:pPr>
+            <w:r>
+              <w:t xml:space="preserve">Kiểm thử tay; ảnh</w:t>
+            </w:r>
+            <w:r>
+              <w:t xml:space="preserve"> </w:t>
+            </w:r>
+            <w:r>
+              <w:rPr>
+                <w:rStyle w:val="VerbatimChar"/>
+              </w:rPr>
+              <w:t xml:space="preserve">docs/TH2/evidence/ui/truoc/dien-bieu-mau-*.png</w:t>
+            </w:r>
+            <w:r>
+              <w:t xml:space="preserve">. Nguyên nhân gốc: quy tắc chung</w:t>
+            </w:r>
+            <w:r>
+              <w:t xml:space="preserve"> </w:t>
+            </w:r>
+            <w:r>
+              <w:rPr>
+                <w:rStyle w:val="VerbatimChar"/>
+              </w:rPr>
+              <w:t xml:space="preserve">input { width: 100% }</w:t>
+            </w:r>
+            <w:r>
+              <w:t xml:space="preserve"> </w:t>
+            </w:r>
+            <w:r>
+              <w:t xml:space="preserve">trong</w:t>
+            </w:r>
+            <w:r>
+              <w:t xml:space="preserve"> </w:t>
+            </w:r>
+            <w:r>
+              <w:rPr>
+                <w:rStyle w:val="VerbatimChar"/>
+              </w:rPr>
+              <w:t xml:space="preserve">globals.css</w:t>
+            </w:r>
+            <w:r>
+              <w:t xml:space="preserve"> </w:t>
+            </w:r>
+            <w:r>
+              <w:t xml:space="preserve">áp cả lên radio/checkbox</w:t>
+            </w:r>
+          </w:p>
+        </w:tc>
+        <w:tc>
+          <w:tcPr/>
+          <w:p>
+            <w:pPr>
+              <w:pStyle w:val="Compact"/>
+            </w:pPr>
+            <w:r>
+              <w:rPr>
+                <w:b/>
+                <w:bCs/>
+              </w:rPr>
+              <w:t xml:space="preserve">Đã xử lý</w:t>
+            </w:r>
+            <w:r>
+              <w:t xml:space="preserve"> </w:t>
+            </w:r>
+            <w:r>
+              <w:t xml:space="preserve">trong PR #18 (issue #17): sửa CSS gốc cho mọi radio/checkbox, bỏ các style inline vá tạm</w:t>
+            </w:r>
+          </w:p>
+        </w:tc>
+      </w:tr>
+      <w:tr>
+        <w:tc>
+          <w:tcPr/>
+          <w:p>
+            <w:pPr>
+              <w:pStyle w:val="Compact"/>
+            </w:pPr>
+            <w:r>
+              <w:t xml:space="preserve">K7</w:t>
+            </w:r>
+          </w:p>
+        </w:tc>
+        <w:tc>
+          <w:tcPr/>
+          <w:p>
+            <w:pPr>
+              <w:pStyle w:val="Compact"/>
+            </w:pPr>
+            <w:r>
+              <w:rPr>
+                <w:b/>
+                <w:bCs/>
+              </w:rPr>
+              <w:t xml:space="preserve">Menu không theo quyền:</w:t>
+            </w:r>
+            <w:r>
+              <w:t xml:space="preserve"> </w:t>
+            </w:r>
+            <w:r>
+              <w:t xml:space="preserve">mọi tài khoản đều thấy</w:t>
+            </w:r>
+            <w:r>
+              <w:t xml:space="preserve"> </w:t>
+            </w:r>
+            <w:r>
+              <w:t xml:space="preserve">“Cơ cấu”</w:t>
+            </w:r>
+            <w:r>
+              <w:t xml:space="preserve"> </w:t>
+            </w:r>
+            <w:r>
+              <w:t xml:space="preserve">và</w:t>
+            </w:r>
+            <w:r>
+              <w:t xml:space="preserve"> </w:t>
+            </w:r>
+            <w:r>
+              <w:t xml:space="preserve">“Xử lý hồ sơ”</w:t>
+            </w:r>
+            <w:r>
+              <w:t xml:space="preserve">. Sinh viên thấy nút</w:t>
+            </w:r>
+            <w:r>
+              <w:t xml:space="preserve"> </w:t>
+            </w:r>
+            <w:r>
+              <w:t xml:space="preserve">“Tạo biểu mẫu”</w:t>
+            </w:r>
+            <w:r>
+              <w:t xml:space="preserve"> </w:t>
+            </w:r>
+            <w:r>
+              <w:t xml:space="preserve">và</w:t>
+            </w:r>
+            <w:r>
+              <w:t xml:space="preserve"> </w:t>
+            </w:r>
+            <w:r>
+              <w:t xml:space="preserve">“Quản lý”</w:t>
+            </w:r>
+            <w:r>
+              <w:t xml:space="preserve">. Trang chủ lặp lại menu và nút đăng nhập.</w:t>
+            </w:r>
+            <w:r>
+              <w:t xml:space="preserve"> </w:t>
+            </w:r>
+            <w:r>
+              <w:t xml:space="preserve">“Tài khoản”</w:t>
+            </w:r>
+            <w:r>
+              <w:t xml:space="preserve"> </w:t>
+            </w:r>
+            <w:r>
+              <w:t xml:space="preserve">nằm trên thanh menu, mở ra là form đổi PIN</w:t>
+            </w:r>
+          </w:p>
+        </w:tc>
+        <w:tc>
+          <w:tcPr/>
+          <w:p>
+            <w:pPr>
+              <w:pStyle w:val="Compact"/>
+            </w:pPr>
+            <w:r>
+              <w:t xml:space="preserve">Kiểm thử tay với tài khoản không có vai trò quản lý; ảnh</w:t>
+            </w:r>
+            <w:r>
+              <w:t xml:space="preserve"> </w:t>
+            </w:r>
+            <w:r>
+              <w:rPr>
+                <w:rStyle w:val="VerbatimChar"/>
+              </w:rPr>
+              <w:t xml:space="preserve">truoc/trang-chu-*.png</w:t>
+            </w:r>
+          </w:p>
+        </w:tc>
+        <w:tc>
+          <w:tcPr/>
+          <w:p>
+            <w:pPr>
+              <w:pStyle w:val="Compact"/>
+            </w:pPr>
+            <w:r>
+              <w:rPr>
+                <w:b/>
+                <w:bCs/>
+              </w:rPr>
+              <w:t xml:space="preserve">Đã xử lý</w:t>
+            </w:r>
+            <w:r>
+              <w:t xml:space="preserve"> </w:t>
+            </w:r>
+            <w:r>
+              <w:t xml:space="preserve">trong PR #18. Quyền thật vẫn do RPC/RLS kiểm tra; trước đây chỉ là hiển thị sai</w:t>
+            </w:r>
+          </w:p>
+        </w:tc>
+      </w:tr>
+      <w:tr>
+        <w:tc>
+          <w:tcPr/>
+          <w:p>
+            <w:pPr>
+              <w:pStyle w:val="Compact"/>
+            </w:pPr>
+            <w:r>
+              <w:t xml:space="preserve">K8</w:t>
+            </w:r>
+          </w:p>
+        </w:tc>
+        <w:tc>
+          <w:tcPr/>
+          <w:p>
+            <w:pPr>
+              <w:pStyle w:val="Compact"/>
+            </w:pPr>
+            <w:r>
+              <w:rPr>
+                <w:b/>
+                <w:bCs/>
+              </w:rPr>
+              <w:t xml:space="preserve">Dữ liệu rác trong DB local đang dùng:</w:t>
+            </w:r>
+            <w:r>
+              <w:t xml:space="preserve"> </w:t>
+            </w:r>
+            <w:r>
+              <w:t xml:space="preserve">biểu mẫu</w:t>
+            </w:r>
+            <w:r>
+              <w:t xml:space="preserve"> </w:t>
+            </w:r>
+            <w:r>
+              <w:t xml:space="preserve">“G6 UI Write Test Form”</w:t>
+            </w:r>
+            <w:r>
+              <w:t xml:space="preserve">, chương trình</w:t>
+            </w:r>
+            <w:r>
+              <w:t xml:space="preserve"> </w:t>
+            </w:r>
+            <w:r>
+              <w:t xml:space="preserve">“Hội trại kỹ năng CNKT 01182/74567”</w:t>
+            </w:r>
+            <w:r>
+              <w:t xml:space="preserve">, tài khoản test chưa có họ tên. Không dùng để trình bày được</w:t>
+            </w:r>
+          </w:p>
+        </w:tc>
+        <w:tc>
+          <w:tcPr/>
+          <w:p>
+            <w:pPr>
+              <w:pStyle w:val="Compact"/>
+            </w:pPr>
+            <w:r>
+              <w:t xml:space="preserve">Ảnh</w:t>
+            </w:r>
+            <w:r>
+              <w:t xml:space="preserve"> </w:t>
+            </w:r>
+            <w:r>
+              <w:rPr>
+                <w:rStyle w:val="VerbatimChar"/>
+              </w:rPr>
+              <w:t xml:space="preserve">truoc/chuong-trinh-danh-sach-desktop.png</w:t>
+            </w:r>
+            <w:r>
+              <w:t xml:space="preserve">,</w:t>
+            </w:r>
+            <w:r>
+              <w:t xml:space="preserve"> </w:t>
+            </w:r>
+            <w:r>
+              <w:rPr>
+                <w:rStyle w:val="VerbatimChar"/>
+              </w:rPr>
+              <w:t xml:space="preserve">truoc/dien-bieu-mau-desktop.png</w:t>
+            </w:r>
+          </w:p>
+        </w:tc>
+        <w:tc>
+          <w:tcPr/>
+          <w:p>
+            <w:pPr>
+              <w:pStyle w:val="Compact"/>
+            </w:pPr>
+            <w:r>
+              <w:rPr>
+                <w:b/>
+                <w:bCs/>
+              </w:rPr>
+              <w:t xml:space="preserve">Xử lý một phần</w:t>
+            </w:r>
+            <w:r>
+              <w:t xml:space="preserve"> </w:t>
+            </w:r>
+            <w:r>
+              <w:t xml:space="preserve">trong PR #18: thêm</w:t>
+            </w:r>
+            <w:r>
+              <w:t xml:space="preserve"> </w:t>
+            </w:r>
+            <w:r>
+              <w:rPr>
+                <w:rStyle w:val="VerbatimChar"/>
+              </w:rPr>
+              <w:t xml:space="preserve">npm run demo:seed</w:t>
+            </w:r>
+            <w:r>
+              <w:t xml:space="preserve"> </w:t>
+            </w:r>
+            <w:r>
+              <w:t xml:space="preserve">và hướng dẫn dựng DB demo trên stack tách biệt (</w:t>
+            </w:r>
+            <w:r>
+              <w:rPr>
+                <w:rStyle w:val="VerbatimChar"/>
+              </w:rPr>
+              <w:t xml:space="preserve">docs/TH2/demo-data.md</w:t>
+            </w:r>
+            <w:r>
+              <w:t xml:space="preserve">). DB đang dùng</w:t>
+            </w:r>
+            <w:r>
+              <w:t xml:space="preserve"> </w:t>
+            </w:r>
+            <w:r>
+              <w:rPr>
+                <w:b/>
+                <w:bCs/>
+              </w:rPr>
+              <w:t xml:space="preserve">chưa dọn</w:t>
+            </w:r>
+            <w:r>
+              <w:t xml:space="preserve">, vì không được reset</w:t>
+            </w:r>
+          </w:p>
+        </w:tc>
+      </w:tr>
+      <w:tr>
+        <w:tc>
+          <w:tcPr/>
+          <w:p>
+            <w:pPr>
+              <w:pStyle w:val="Compact"/>
+            </w:pPr>
+            <w:r>
+              <w:t xml:space="preserve">K9</w:t>
+            </w:r>
+          </w:p>
+        </w:tc>
+        <w:tc>
+          <w:tcPr/>
+          <w:p>
+            <w:pPr>
+              <w:pStyle w:val="Compact"/>
+            </w:pPr>
+            <w:r>
+              <w:t xml:space="preserve">Bảng chương trình/biểu mẫu bị bóp hẹp trên điện thoại (mất nút</w:t>
+            </w:r>
+            <w:r>
+              <w:t xml:space="preserve"> </w:t>
+            </w:r>
+            <w:r>
+              <w:t xml:space="preserve">“Xem”</w:t>
+            </w:r>
+            <w:r>
+              <w:t xml:space="preserve">). Sinh viên không biết vì sao không đăng ký được (chỉ thấy</w:t>
+            </w:r>
+            <w:r>
+              <w:t xml:space="preserve"> </w:t>
+            </w:r>
+            <w:r>
+              <w:t xml:space="preserve">“không nhận đăng ký”</w:t>
+            </w:r>
+            <w:r>
+              <w:t xml:space="preserve">)</w:t>
+            </w:r>
+          </w:p>
+        </w:tc>
+        <w:tc>
+          <w:tcPr/>
+          <w:p>
+            <w:pPr>
+              <w:pStyle w:val="Compact"/>
+            </w:pPr>
+            <w:r>
+              <w:t xml:space="preserve">Ảnh</w:t>
+            </w:r>
+            <w:r>
+              <w:t xml:space="preserve"> </w:t>
+            </w:r>
+            <w:r>
+              <w:rPr>
+                <w:rStyle w:val="VerbatimChar"/>
+              </w:rPr>
+              <w:t xml:space="preserve">truoc/chuong-trinh-*-mobile.png</w:t>
+            </w:r>
+          </w:p>
+        </w:tc>
+        <w:tc>
+          <w:tcPr/>
+          <w:p>
+            <w:pPr>
+              <w:pStyle w:val="Compact"/>
+            </w:pPr>
+            <w:r>
+              <w:rPr>
+                <w:b/>
+                <w:bCs/>
+              </w:rPr>
+              <w:t xml:space="preserve">Đã xử lý</w:t>
+            </w:r>
+            <w:r>
+              <w:t xml:space="preserve"> </w:t>
+            </w:r>
+            <w:r>
+              <w:t xml:space="preserve">trong PR #18: bảng dạng thẻ trên điện thoại; nêu lý do đã đóng, hết chỗ hoặc sai đối tượng</w:t>
             </w:r>
           </w:p>
         </w:tc>
@@ -3415,6 +3897,276 @@
                 <w:rStyle w:val="VerbatimChar"/>
               </w:rPr>
               <w:t xml:space="preserve">6467a31</w:t>
+            </w:r>
+          </w:p>
+        </w:tc>
+      </w:tr>
+      <w:tr>
+        <w:tc>
+          <w:tcPr/>
+          <w:p>
+            <w:pPr>
+              <w:pStyle w:val="Compact"/>
+            </w:pPr>
+            <w:r>
+              <w:t xml:space="preserve">D2 — Điền MSSV, lớp</w:t>
+            </w:r>
+          </w:p>
+        </w:tc>
+        <w:tc>
+          <w:tcPr/>
+          <w:p>
+            <w:pPr>
+              <w:pStyle w:val="Compact"/>
+            </w:pPr>
+            <w:r>
+              <w:t xml:space="preserve">#15</w:t>
+            </w:r>
+          </w:p>
+        </w:tc>
+        <w:tc>
+          <w:tcPr/>
+          <w:p>
+            <w:pPr>
+              <w:pStyle w:val="Compact"/>
+            </w:pPr>
+            <w:r>
+              <w:rPr>
+                <w:rStyle w:val="VerbatimChar"/>
+              </w:rPr>
+              <w:t xml:space="preserve">docs/15-th1-thong-tin-sv</w:t>
+            </w:r>
+          </w:p>
+        </w:tc>
+        <w:tc>
+          <w:tcPr/>
+          <w:p>
+            <w:pPr>
+              <w:pStyle w:val="Compact"/>
+            </w:pPr>
+            <w:r>
+              <w:t xml:space="preserve">#16</w:t>
+            </w:r>
+          </w:p>
+        </w:tc>
+        <w:tc>
+          <w:tcPr/>
+          <w:p>
+            <w:pPr>
+              <w:pStyle w:val="Compact"/>
+            </w:pPr>
+            <w:r>
+              <w:t xml:space="preserve">quality: pass (1m18s)</w:t>
+            </w:r>
+          </w:p>
+        </w:tc>
+        <w:tc>
+          <w:tcPr/>
+          <w:p>
+            <w:pPr>
+              <w:pStyle w:val="Compact"/>
+            </w:pPr>
+            <w:r>
+              <w:t xml:space="preserve">Đã merge</w:t>
+            </w:r>
+            <w:r>
+              <w:t xml:space="preserve"> </w:t>
+            </w:r>
+            <w:r>
+              <w:rPr>
+                <w:rStyle w:val="VerbatimChar"/>
+              </w:rPr>
+              <w:t xml:space="preserve">2713860</w:t>
+            </w:r>
+          </w:p>
+        </w:tc>
+      </w:tr>
+    </w:tbl>
+    <w:p>
+      <w:pPr>
+        <w:pStyle w:val="BodyText"/>
+      </w:pPr>
+      <w:r>
+        <w:t xml:space="preserve">Sau khi nộp TH1, phần sửa giao diện thuộc Milestone</w:t>
+      </w:r>
+      <w:r>
+        <w:t xml:space="preserve"> </w:t>
+      </w:r>
+      <w:r>
+        <w:rPr>
+          <w:rStyle w:val="VerbatimChar"/>
+        </w:rPr>
+        <w:t xml:space="preserve">TH2</w:t>
+      </w:r>
+      <w:r>
+        <w:t xml:space="preserve"> </w:t>
+      </w:r>
+      <w:r>
+        <w:t xml:space="preserve">và theo cùng quy trình:</w:t>
+      </w:r>
+    </w:p>
+    <w:tbl>
+      <w:tblPr>
+        <w:tblStyle w:val="Table"/>
+        <w:tblW w:type="pct" w:w="5000"/>
+        <w:tblLayout w:type="fixed"/>
+        <w:tblLook w:firstRow="1" w:lastRow="0" w:firstColumn="0" w:lastColumn="0" w:noHBand="0" w:noVBand="0" w:val="0020"/>
+      </w:tblPr>
+      <w:tblGrid>
+        <w:gridCol w:w="1320"/>
+        <w:gridCol w:w="1320"/>
+        <w:gridCol w:w="1320"/>
+        <w:gridCol w:w="1320"/>
+        <w:gridCol w:w="1320"/>
+        <w:gridCol w:w="1320"/>
+      </w:tblGrid>
+      <w:tr>
+        <w:trPr>
+          <w:tblHeader w:val="on"/>
+        </w:trPr>
+        <w:tc>
+          <w:tcPr/>
+          <w:p>
+            <w:pPr>
+              <w:pStyle w:val="Compact"/>
+            </w:pPr>
+            <w:r>
+              <w:t xml:space="preserve">Mục</w:t>
+            </w:r>
+          </w:p>
+        </w:tc>
+        <w:tc>
+          <w:tcPr/>
+          <w:p>
+            <w:pPr>
+              <w:pStyle w:val="Compact"/>
+            </w:pPr>
+            <w:r>
+              <w:t xml:space="preserve">Issue</w:t>
+            </w:r>
+          </w:p>
+        </w:tc>
+        <w:tc>
+          <w:tcPr/>
+          <w:p>
+            <w:pPr>
+              <w:pStyle w:val="Compact"/>
+            </w:pPr>
+            <w:r>
+              <w:t xml:space="preserve">Branch</w:t>
+            </w:r>
+          </w:p>
+        </w:tc>
+        <w:tc>
+          <w:tcPr/>
+          <w:p>
+            <w:pPr>
+              <w:pStyle w:val="Compact"/>
+            </w:pPr>
+            <w:r>
+              <w:t xml:space="preserve">PR</w:t>
+            </w:r>
+          </w:p>
+        </w:tc>
+        <w:tc>
+          <w:tcPr/>
+          <w:p>
+            <w:pPr>
+              <w:pStyle w:val="Compact"/>
+            </w:pPr>
+            <w:r>
+              <w:t xml:space="preserve">CI</w:t>
+            </w:r>
+          </w:p>
+        </w:tc>
+        <w:tc>
+          <w:tcPr/>
+          <w:p>
+            <w:pPr>
+              <w:pStyle w:val="Compact"/>
+            </w:pPr>
+            <w:r>
+              <w:t xml:space="preserve">Kết quả</w:t>
+            </w:r>
+          </w:p>
+        </w:tc>
+      </w:tr>
+      <w:tr>
+        <w:tc>
+          <w:tcPr/>
+          <w:p>
+            <w:pPr>
+              <w:pStyle w:val="Compact"/>
+            </w:pPr>
+            <w:r>
+              <w:t xml:space="preserve">E — Sửa giao diện, dữ liệu demo</w:t>
+            </w:r>
+          </w:p>
+        </w:tc>
+        <w:tc>
+          <w:tcPr/>
+          <w:p>
+            <w:pPr>
+              <w:pStyle w:val="Compact"/>
+            </w:pPr>
+            <w:r>
+              <w:t xml:space="preserve">#17</w:t>
+            </w:r>
+          </w:p>
+        </w:tc>
+        <w:tc>
+          <w:tcPr/>
+          <w:p>
+            <w:pPr>
+              <w:pStyle w:val="Compact"/>
+            </w:pPr>
+            <w:r>
+              <w:rPr>
+                <w:rStyle w:val="VerbatimChar"/>
+              </w:rPr>
+              <w:t xml:space="preserve">fix/17-ui-polish</w:t>
+            </w:r>
+          </w:p>
+        </w:tc>
+        <w:tc>
+          <w:tcPr/>
+          <w:p>
+            <w:pPr>
+              <w:pStyle w:val="Compact"/>
+            </w:pPr>
+            <w:r>
+              <w:t xml:space="preserve">#18</w:t>
+            </w:r>
+          </w:p>
+        </w:tc>
+        <w:tc>
+          <w:tcPr/>
+          <w:p>
+            <w:pPr>
+              <w:pStyle w:val="Compact"/>
+            </w:pPr>
+            <w:r>
+              <w:t xml:space="preserve">quality: pass (1m0s)</w:t>
+            </w:r>
+          </w:p>
+        </w:tc>
+        <w:tc>
+          <w:tcPr/>
+          <w:p>
+            <w:pPr>
+              <w:pStyle w:val="Compact"/>
+            </w:pPr>
+            <w:r>
+              <w:t xml:space="preserve">Đã merge</w:t>
+            </w:r>
+            <w:r>
+              <w:t xml:space="preserve"> </w:t>
+            </w:r>
+            <w:r>
+              <w:rPr>
+                <w:rStyle w:val="VerbatimChar"/>
+              </w:rPr>
+              <w:t xml:space="preserve">bd06583</w:t>
             </w:r>
           </w:p>
         </w:tc>
@@ -12977,7 +13729,7 @@
     </w:p>
     <w:bookmarkEnd w:id="80"/>
     <w:bookmarkEnd w:id="81"/>
-    <w:bookmarkStart w:id="82" w:name="vấn-đề-gặp-phải-và-cách-xử-lý"/>
+    <w:bookmarkStart w:id="100" w:name="vấn-đề-gặp-phải-và-cách-xử-lý"/>
     <w:p>
       <w:pPr>
         <w:pStyle w:val="Heading1"/>
@@ -13623,6 +14375,126 @@
               <w:pStyle w:val="Compact"/>
             </w:pPr>
             <w:r>
+              <w:t xml:space="preserve">Kiểm thử tay giao diện thấy radio/checkbox lệch (K6), menu hiện cả mục không có quyền (K7), dữ liệu rác (K8), bảng vỡ trên điện thoại (K9)</w:t>
+            </w:r>
+          </w:p>
+        </w:tc>
+        <w:tc>
+          <w:tcPr/>
+          <w:p>
+            <w:pPr>
+              <w:pStyle w:val="Compact"/>
+            </w:pPr>
+            <w:r>
+              <w:t xml:space="preserve">Sửa trong PR #18 (issue #17). Chụp ảnh trước/sau bằng Playwright trên bản build production, desktop 1366 px và mobile 390 px, rồi xem lại từng ảnh trước khi merge. Lỗi phụ thấy khi xem ảnh (giờ UTC ở hạn biểu mẫu,</w:t>
+            </w:r>
+            <w:r>
+              <w:t xml:space="preserve"> </w:t>
+            </w:r>
+            <w:r>
+              <w:t xml:space="preserve">“Đoàn Khoa Khoa”</w:t>
+            </w:r>
+            <w:r>
+              <w:t xml:space="preserve">, mã trạng thái tiếng Anh) cũng được sửa trong cùng PR. Danh sách đủ 38 ảnh:</w:t>
+            </w:r>
+            <w:r>
+              <w:t xml:space="preserve"> </w:t>
+            </w:r>
+            <w:r>
+              <w:rPr>
+                <w:rStyle w:val="VerbatimChar"/>
+              </w:rPr>
+              <w:t xml:space="preserve">docs/TH2/evidence/ui/README.md</w:t>
+            </w:r>
+          </w:p>
+        </w:tc>
+      </w:tr>
+      <w:tr>
+        <w:tc>
+          <w:tcPr/>
+          <w:p>
+            <w:pPr>
+              <w:pStyle w:val="Compact"/>
+            </w:pPr>
+            <w:r>
+              <w:t xml:space="preserve">Không thể dọn dữ liệu rác bằng</w:t>
+            </w:r>
+            <w:r>
+              <w:t xml:space="preserve"> </w:t>
+            </w:r>
+            <w:r>
+              <w:rPr>
+                <w:rStyle w:val="VerbatimChar"/>
+              </w:rPr>
+              <w:t xml:space="preserve">db reset</w:t>
+            </w:r>
+            <w:r>
+              <w:t xml:space="preserve"> </w:t>
+            </w:r>
+            <w:r>
+              <w:t xml:space="preserve">vì DB đang dùng</w:t>
+            </w:r>
+          </w:p>
+        </w:tc>
+        <w:tc>
+          <w:tcPr/>
+          <w:p>
+            <w:pPr>
+              <w:pStyle w:val="Compact"/>
+            </w:pPr>
+            <w:r>
+              <w:t xml:space="preserve">Viết</w:t>
+            </w:r>
+            <w:r>
+              <w:t xml:space="preserve"> </w:t>
+            </w:r>
+            <w:r>
+              <w:rPr>
+                <w:rStyle w:val="VerbatimChar"/>
+              </w:rPr>
+              <w:t xml:space="preserve">scripts/seed-demo.mjs</w:t>
+            </w:r>
+            <w:r>
+              <w:t xml:space="preserve">. Script chỉ chạy với Supabase local, cần cờ</w:t>
+            </w:r>
+            <w:r>
+              <w:t xml:space="preserve"> </w:t>
+            </w:r>
+            <w:r>
+              <w:rPr>
+                <w:rStyle w:val="VerbatimChar"/>
+              </w:rPr>
+              <w:t xml:space="preserve">--confirm-demo</w:t>
+            </w:r>
+            <w:r>
+              <w:t xml:space="preserve">, không đọc</w:t>
+            </w:r>
+            <w:r>
+              <w:t xml:space="preserve"> </w:t>
+            </w:r>
+            <w:r>
+              <w:rPr>
+                <w:rStyle w:val="VerbatimChar"/>
+              </w:rPr>
+              <w:t xml:space="preserve">.env.local</w:t>
+            </w:r>
+            <w:r>
+              <w:t xml:space="preserve"> </w:t>
+            </w:r>
+            <w:r>
+              <w:t xml:space="preserve">và từ chối khi DB đã có tài khoản; đã thử với DB đang dùng và bị từ chối đúng. Dữ liệu demo dựng trên stack tách biệt (cổng 553xx)</w:t>
+            </w:r>
+          </w:p>
+        </w:tc>
+      </w:tr>
+      <w:tr>
+        <w:tc>
+          <w:tcPr/>
+          <w:p>
+            <w:pPr>
+              <w:pStyle w:val="Compact"/>
+            </w:pPr>
+            <w:r>
               <w:t xml:space="preserve">Máy chưa có</w:t>
             </w:r>
             <w:r>
@@ -13695,6 +14567,468 @@
                 <w:rStyle w:val="VerbatimChar"/>
               </w:rPr>
               <w:t xml:space="preserve">minlag/mermaid-cli</w:t>
+            </w:r>
+          </w:p>
+        </w:tc>
+      </w:tr>
+    </w:tbl>
+    <w:p>
+      <w:pPr>
+        <w:pStyle w:val="BodyText"/>
+      </w:pPr>
+      <w:r>
+        <w:rPr>
+          <w:b/>
+          <w:bCs/>
+        </w:rPr>
+        <w:t xml:space="preserve">Ảnh trước/sau (PR #18).</w:t>
+      </w:r>
+      <w:r>
+        <w:t xml:space="preserve"> </w:t>
+      </w:r>
+      <w:r>
+        <w:t xml:space="preserve">Ảnh</w:t>
+      </w:r>
+      <w:r>
+        <w:t xml:space="preserve"> </w:t>
+      </w:r>
+      <w:r>
+        <w:t xml:space="preserve">“trước”</w:t>
+      </w:r>
+      <w:r>
+        <w:t xml:space="preserve"> </w:t>
+      </w:r>
+      <w:r>
+        <w:t xml:space="preserve">chụp từ</w:t>
+      </w:r>
+      <w:r>
+        <w:t xml:space="preserve"> </w:t>
+      </w:r>
+      <w:r>
+        <w:rPr>
+          <w:rStyle w:val="VerbatimChar"/>
+        </w:rPr>
+        <w:t xml:space="preserve">main</w:t>
+      </w:r>
+      <w:r>
+        <w:t xml:space="preserve"> </w:t>
+      </w:r>
+      <w:r>
+        <w:t xml:space="preserve">cũ trên DB đang dùng. Ảnh</w:t>
+      </w:r>
+      <w:r>
+        <w:t xml:space="preserve"> </w:t>
+      </w:r>
+      <w:r>
+        <w:t xml:space="preserve">“sau”</w:t>
+      </w:r>
+      <w:r>
+        <w:t xml:space="preserve"> </w:t>
+      </w:r>
+      <w:r>
+        <w:t xml:space="preserve">chụp trên stack demo đã seed.</w:t>
+      </w:r>
+    </w:p>
+    <w:p>
+      <w:pPr>
+        <w:pStyle w:val="BodyText"/>
+      </w:pPr>
+      <w:r>
+        <w:t xml:space="preserve">Trang điền biểu mẫu (K6), trước:</w:t>
+      </w:r>
+    </w:p>
+    <w:p>
+      <w:pPr>
+        <w:pStyle w:val="CaptionedFigure"/>
+      </w:pPr>
+      <w:r>
+        <w:drawing>
+          <wp:inline>
+            <wp:extent cx="5334000" cy="3358155"/>
+            <wp:effectExtent b="0" l="0" r="0" t="0"/>
+            <wp:docPr descr="Trước: radio bị kéo giãn, nhãn nằm ở mép phải" title="" id="83" name="Picture"/>
+            <a:graphic>
+              <a:graphicData uri="http://schemas.openxmlformats.org/drawingml/2006/picture">
+                <pic:pic>
+                  <pic:nvPicPr>
+                    <pic:cNvPr descr="../TH2/evidence/ui/truoc/dien-bieu-mau-desktop.png" id="84" name="Picture"/>
+                    <pic:cNvPicPr>
+                      <a:picLocks noChangeArrowheads="1" noChangeAspect="1"/>
+                    </pic:cNvPicPr>
+                  </pic:nvPicPr>
+                  <pic:blipFill>
+                    <a:blip r:embed="rId82"/>
+                    <a:stretch>
+                      <a:fillRect/>
+                    </a:stretch>
+                  </pic:blipFill>
+                  <pic:spPr bwMode="auto">
+                    <a:xfrm>
+                      <a:off x="0" y="0"/>
+                      <a:ext cx="5334000" cy="3358155"/>
+                    </a:xfrm>
+                    <a:prstGeom prst="rect">
+                      <a:avLst/>
+                    </a:prstGeom>
+                    <a:noFill/>
+                    <a:ln w="9525">
+                      <a:noFill/>
+                      <a:headEnd/>
+                      <a:tailEnd/>
+                    </a:ln>
+                  </pic:spPr>
+                </pic:pic>
+              </a:graphicData>
+            </a:graphic>
+          </wp:inline>
+        </w:drawing>
+      </w:r>
+    </w:p>
+    <w:p>
+      <w:pPr>
+        <w:pStyle w:val="ImageCaption"/>
+      </w:pPr>
+      <w:r>
+        <w:t xml:space="preserve">Trước: radio bị kéo giãn, nhãn nằm ở mép phải</w:t>
+      </w:r>
+    </w:p>
+    <w:p>
+      <w:pPr>
+        <w:pStyle w:val="BodyText"/>
+      </w:pPr>
+      <w:r>
+        <w:t xml:space="preserve">Sau:</w:t>
+      </w:r>
+    </w:p>
+    <w:p>
+      <w:pPr>
+        <w:pStyle w:val="CaptionedFigure"/>
+      </w:pPr>
+      <w:r>
+        <w:drawing>
+          <wp:inline>
+            <wp:extent cx="5334000" cy="3881402"/>
+            <wp:effectExtent b="0" l="0" r="0" t="0"/>
+            <wp:docPr descr="Sau: radio/checkbox nằm sát nhãn bên trái" title="" id="86" name="Picture"/>
+            <a:graphic>
+              <a:graphicData uri="http://schemas.openxmlformats.org/drawingml/2006/picture">
+                <pic:pic>
+                  <pic:nvPicPr>
+                    <pic:cNvPr descr="../TH2/evidence/ui/sau/dien-bieu-mau-desktop.png" id="87" name="Picture"/>
+                    <pic:cNvPicPr>
+                      <a:picLocks noChangeArrowheads="1" noChangeAspect="1"/>
+                    </pic:cNvPicPr>
+                  </pic:nvPicPr>
+                  <pic:blipFill>
+                    <a:blip r:embed="rId85"/>
+                    <a:stretch>
+                      <a:fillRect/>
+                    </a:stretch>
+                  </pic:blipFill>
+                  <pic:spPr bwMode="auto">
+                    <a:xfrm>
+                      <a:off x="0" y="0"/>
+                      <a:ext cx="5334000" cy="3881402"/>
+                    </a:xfrm>
+                    <a:prstGeom prst="rect">
+                      <a:avLst/>
+                    </a:prstGeom>
+                    <a:noFill/>
+                    <a:ln w="9525">
+                      <a:noFill/>
+                      <a:headEnd/>
+                      <a:tailEnd/>
+                    </a:ln>
+                  </pic:spPr>
+                </pic:pic>
+              </a:graphicData>
+            </a:graphic>
+          </wp:inline>
+        </w:drawing>
+      </w:r>
+    </w:p>
+    <w:p>
+      <w:pPr>
+        <w:pStyle w:val="ImageCaption"/>
+      </w:pPr>
+      <w:r>
+        <w:t xml:space="preserve">Sau: radio/checkbox nằm sát nhãn bên trái</w:t>
+      </w:r>
+    </w:p>
+    <w:p>
+      <w:pPr>
+        <w:pStyle w:val="BodyText"/>
+      </w:pPr>
+      <w:r>
+        <w:t xml:space="preserve">Trang chủ khi đã đăng nhập (K7), trước:</w:t>
+      </w:r>
+    </w:p>
+    <w:p>
+      <w:pPr>
+        <w:pStyle w:val="CaptionedFigure"/>
+      </w:pPr>
+      <w:r>
+        <w:drawing>
+          <wp:inline>
+            <wp:extent cx="5334000" cy="3424537"/>
+            <wp:effectExtent b="0" l="0" r="0" t="0"/>
+            <wp:docPr descr="Trước: menu có Cơ cấu, Xử lý hồ sơ, Tài khoản; trang chủ lặp menu và nút đăng nhập" title="" id="89" name="Picture"/>
+            <a:graphic>
+              <a:graphicData uri="http://schemas.openxmlformats.org/drawingml/2006/picture">
+                <pic:pic>
+                  <pic:nvPicPr>
+                    <pic:cNvPr descr="../TH2/evidence/ui/truoc/trang-chu-sinh-vien-desktop.png" id="90" name="Picture"/>
+                    <pic:cNvPicPr>
+                      <a:picLocks noChangeArrowheads="1" noChangeAspect="1"/>
+                    </pic:cNvPicPr>
+                  </pic:nvPicPr>
+                  <pic:blipFill>
+                    <a:blip r:embed="rId88"/>
+                    <a:stretch>
+                      <a:fillRect/>
+                    </a:stretch>
+                  </pic:blipFill>
+                  <pic:spPr bwMode="auto">
+                    <a:xfrm>
+                      <a:off x="0" y="0"/>
+                      <a:ext cx="5334000" cy="3424537"/>
+                    </a:xfrm>
+                    <a:prstGeom prst="rect">
+                      <a:avLst/>
+                    </a:prstGeom>
+                    <a:noFill/>
+                    <a:ln w="9525">
+                      <a:noFill/>
+                      <a:headEnd/>
+                      <a:tailEnd/>
+                    </a:ln>
+                  </pic:spPr>
+                </pic:pic>
+              </a:graphicData>
+            </a:graphic>
+          </wp:inline>
+        </w:drawing>
+      </w:r>
+    </w:p>
+    <w:p>
+      <w:pPr>
+        <w:pStyle w:val="ImageCaption"/>
+      </w:pPr>
+      <w:r>
+        <w:t xml:space="preserve">Trước: menu có Cơ cấu, Xử lý hồ sơ, Tài khoản; trang chủ lặp menu và nút đăng nhập</w:t>
+      </w:r>
+    </w:p>
+    <w:p>
+      <w:pPr>
+        <w:pStyle w:val="BodyText"/>
+      </w:pPr>
+      <w:r>
+        <w:t xml:space="preserve">Sau:</w:t>
+      </w:r>
+    </w:p>
+    <w:p>
+      <w:pPr>
+        <w:pStyle w:val="CaptionedFigure"/>
+      </w:pPr>
+      <w:r>
+        <w:drawing>
+          <wp:inline>
+            <wp:extent cx="5334000" cy="3440156"/>
+            <wp:effectExtent b="0" l="0" r="0" t="0"/>
+            <wp:docPr descr="Sau: menu theo quyền, tài khoản ở góc phải, khối Việc của tôi" title="" id="92" name="Picture"/>
+            <a:graphic>
+              <a:graphicData uri="http://schemas.openxmlformats.org/drawingml/2006/picture">
+                <pic:pic>
+                  <pic:nvPicPr>
+                    <pic:cNvPr descr="../TH2/evidence/ui/sau/trang-chu-sinh-vien-desktop.png" id="93" name="Picture"/>
+                    <pic:cNvPicPr>
+                      <a:picLocks noChangeArrowheads="1" noChangeAspect="1"/>
+                    </pic:cNvPicPr>
+                  </pic:nvPicPr>
+                  <pic:blipFill>
+                    <a:blip r:embed="rId91"/>
+                    <a:stretch>
+                      <a:fillRect/>
+                    </a:stretch>
+                  </pic:blipFill>
+                  <pic:spPr bwMode="auto">
+                    <a:xfrm>
+                      <a:off x="0" y="0"/>
+                      <a:ext cx="5334000" cy="3440156"/>
+                    </a:xfrm>
+                    <a:prstGeom prst="rect">
+                      <a:avLst/>
+                    </a:prstGeom>
+                    <a:noFill/>
+                    <a:ln w="9525">
+                      <a:noFill/>
+                      <a:headEnd/>
+                      <a:tailEnd/>
+                    </a:ln>
+                  </pic:spPr>
+                </pic:pic>
+              </a:graphicData>
+            </a:graphic>
+          </wp:inline>
+        </w:drawing>
+      </w:r>
+    </w:p>
+    <w:p>
+      <w:pPr>
+        <w:pStyle w:val="ImageCaption"/>
+      </w:pPr>
+      <w:r>
+        <w:t xml:space="preserve">Sau: menu theo quyền, tài khoản ở góc phải, khối Việc của tôi</w:t>
+      </w:r>
+    </w:p>
+    <w:p>
+      <w:pPr>
+        <w:pStyle w:val="BodyText"/>
+      </w:pPr>
+      <w:r>
+        <w:t xml:space="preserve">Danh sách chương trình trên điện thoại (K8, K9):</w:t>
+      </w:r>
+    </w:p>
+    <w:tbl>
+      <w:tblPr>
+        <w:tblStyle w:val="Table"/>
+        <w:tblW w:type="pct" w:w="5000"/>
+        <w:tblLayout w:type="fixed"/>
+        <w:tblLook w:firstRow="1" w:lastRow="0" w:firstColumn="0" w:lastColumn="0" w:noHBand="0" w:noVBand="0" w:val="0020"/>
+      </w:tblPr>
+      <w:tblGrid>
+        <w:gridCol w:w="3960"/>
+        <w:gridCol w:w="3960"/>
+      </w:tblGrid>
+      <w:tr>
+        <w:trPr>
+          <w:tblHeader w:val="on"/>
+        </w:trPr>
+        <w:tc>
+          <w:tcPr/>
+          <w:p>
+            <w:pPr>
+              <w:pStyle w:val="Compact"/>
+              <w:jc w:val="center"/>
+            </w:pPr>
+            <w:r>
+              <w:t xml:space="preserve">Trước</w:t>
+            </w:r>
+          </w:p>
+        </w:tc>
+        <w:tc>
+          <w:tcPr/>
+          <w:p>
+            <w:pPr>
+              <w:pStyle w:val="Compact"/>
+              <w:jc w:val="center"/>
+            </w:pPr>
+            <w:r>
+              <w:t xml:space="preserve">Sau</w:t>
+            </w:r>
+          </w:p>
+        </w:tc>
+      </w:tr>
+      <w:tr>
+        <w:tc>
+          <w:tcPr/>
+          <w:p>
+            <w:pPr>
+              <w:pStyle w:val="Compact"/>
+              <w:jc w:val="center"/>
+            </w:pPr>
+            <w:r>
+              <w:drawing>
+                <wp:inline>
+                  <wp:extent cx="1323279" cy="3599999"/>
+                  <wp:effectExtent b="0" l="0" r="0" t="0"/>
+                  <wp:docPr descr="" title="" id="95" name="Picture"/>
+                  <a:graphic>
+                    <a:graphicData uri="http://schemas.openxmlformats.org/drawingml/2006/picture">
+                      <pic:pic>
+                        <pic:nvPicPr>
+                          <pic:cNvPr descr="../TH2/evidence/ui/truoc/chuong-trinh-danh-sach-mobile.png" id="96" name="Picture"/>
+                          <pic:cNvPicPr>
+                            <a:picLocks noChangeArrowheads="1" noChangeAspect="1"/>
+                          </pic:cNvPicPr>
+                        </pic:nvPicPr>
+                        <pic:blipFill>
+                          <a:blip r:embed="rId94"/>
+                          <a:stretch>
+                            <a:fillRect/>
+                          </a:stretch>
+                        </pic:blipFill>
+                        <pic:spPr bwMode="auto">
+                          <a:xfrm>
+                            <a:off x="0" y="0"/>
+                            <a:ext cx="1323279" cy="3599999"/>
+                          </a:xfrm>
+                          <a:prstGeom prst="rect">
+                            <a:avLst/>
+                          </a:prstGeom>
+                          <a:noFill/>
+                          <a:ln w="9525">
+                            <a:noFill/>
+                            <a:headEnd/>
+                            <a:tailEnd/>
+                          </a:ln>
+                        </pic:spPr>
+                      </pic:pic>
+                    </a:graphicData>
+                  </a:graphic>
+                </wp:inline>
+              </w:drawing>
+            </w:r>
+          </w:p>
+        </w:tc>
+        <w:tc>
+          <w:tcPr/>
+          <w:p>
+            <w:pPr>
+              <w:pStyle w:val="Compact"/>
+              <w:jc w:val="center"/>
+            </w:pPr>
+            <w:r>
+              <w:drawing>
+                <wp:inline>
+                  <wp:extent cx="1282191" cy="3599999"/>
+                  <wp:effectExtent b="0" l="0" r="0" t="0"/>
+                  <wp:docPr descr="" title="" id="98" name="Picture"/>
+                  <a:graphic>
+                    <a:graphicData uri="http://schemas.openxmlformats.org/drawingml/2006/picture">
+                      <pic:pic>
+                        <pic:nvPicPr>
+                          <pic:cNvPr descr="../TH2/evidence/ui/sau/chuong-trinh-danh-sach-mobile.png" id="99" name="Picture"/>
+                          <pic:cNvPicPr>
+                            <a:picLocks noChangeArrowheads="1" noChangeAspect="1"/>
+                          </pic:cNvPicPr>
+                        </pic:nvPicPr>
+                        <pic:blipFill>
+                          <a:blip r:embed="rId97"/>
+                          <a:stretch>
+                            <a:fillRect/>
+                          </a:stretch>
+                        </pic:blipFill>
+                        <pic:spPr bwMode="auto">
+                          <a:xfrm>
+                            <a:off x="0" y="0"/>
+                            <a:ext cx="1282191" cy="3599999"/>
+                          </a:xfrm>
+                          <a:prstGeom prst="rect">
+                            <a:avLst/>
+                          </a:prstGeom>
+                          <a:noFill/>
+                          <a:ln w="9525">
+                            <a:noFill/>
+                            <a:headEnd/>
+                            <a:tailEnd/>
+                          </a:ln>
+                        </pic:spPr>
+                      </pic:pic>
+                    </a:graphicData>
+                  </a:graphic>
+                </wp:inline>
+              </w:drawing>
             </w:r>
           </w:p>
         </w:tc>
@@ -13996,8 +15330,8 @@
         <w:t xml:space="preserve">Sinh viên đọc lại báo cáo trước khi merge PR mục D.</w:t>
       </w:r>
     </w:p>
-    <w:bookmarkEnd w:id="82"/>
-    <w:bookmarkStart w:id="83" w:name="nhận-xét-kết-luận-và-ý-tưởng-cr-01"/>
+    <w:bookmarkEnd w:id="100"/>
+    <w:bookmarkStart w:id="101" w:name="nhận-xét-kết-luận-và-ý-tưởng-cr-01"/>
     <w:p>
       <w:pPr>
         <w:pStyle w:val="Heading1"/>
@@ -14336,7 +15670,7 @@
         <w:t xml:space="preserve">CR-01 dự kiến theo hướng kỹ thuật nâng cao: bổ sung thông báo real-time trong ứng dụng (Supabase Realtime) khi kế hoạch chương trình được Văn phòng duyệt hoặc trả sửa và khi kết quả đăng ký của sinh viên thay đổi, thay cho việc người dùng phải tự tải lại trang để kiểm tra.</w:t>
       </w:r>
     </w:p>
-    <w:bookmarkEnd w:id="83"/>
+    <w:bookmarkEnd w:id="101"/>
     <w:sectPr>
       <w:footnotePr>
         <w:numRestart w:val="eachSect"/>

</xml_diff>

<commit_message>
docs(th1): gom PR #16–#20 vào Milestone TH1, dời ảnh trước/sau sang docs/TH1, chụp lại git log trước khi merge PR #20 (#19)
- Bảng 3.4 liệt kê đủ 7 PR của Milestone TH1 (#8–#20); bỏ câu ngụ ý TH1 đã nộp
- Ảnh trước/sau và README đối chiếu: docs/TH2/evidence/ui -> docs/TH1/evidence/ui
- Mục 3.5: chạy lại 2 lệnh git log trên origin/main (bd06583), ảnh Terminal mới
- Build lại BaoCao_TH1.docx

Co-Authored-By: Claude Opus 5.5 <noreply@anthropic.com>
</commit_message>
<xml_diff>
--- a/docs/TH1/BaoCao_TH1.docx
+++ b/docs/TH1/BaoCao_TH1.docx
@@ -254,7 +254,7 @@
               <w:pStyle w:val="Compact"/>
             </w:pPr>
             <w:r>
-              <w:t xml:space="preserve">16/10/2026 (lấy bằng lệnh</w:t>
+              <w:t xml:space="preserve">16–20/10/2026 (lấy bằng lệnh</w:t>
             </w:r>
             <w:r>
               <w:t xml:space="preserve"> </w:t>
@@ -383,10 +383,7 @@
               <w:t xml:space="preserve">TH1</w:t>
             </w:r>
             <w:r>
-              <w:t xml:space="preserve"> </w:t>
-            </w:r>
-            <w:r>
-              <w:t xml:space="preserve">(issue #7, #9, #11, #13)</w:t>
+              <w:t xml:space="preserve">: issue #7, #9, #11, #13, #15, #17, #19; PR #8, #10, #12, #14, #16, #18, #20</w:t>
             </w:r>
           </w:p>
         </w:tc>
@@ -2649,7 +2646,7 @@
               <w:rPr>
                 <w:rStyle w:val="VerbatimChar"/>
               </w:rPr>
-              <w:t xml:space="preserve">docs/TH2/evidence/ui/truoc/dien-bieu-mau-*.png</w:t>
+              <w:t xml:space="preserve">docs/TH1/evidence/ui/truoc/dien-bieu-mau-*.png</w:t>
             </w:r>
             <w:r>
               <w:t xml:space="preserve">. Nguyên nhân gốc: quy tắc chung</w:t>
@@ -3909,7 +3906,7 @@
               <w:pStyle w:val="Compact"/>
             </w:pPr>
             <w:r>
-              <w:t xml:space="preserve">D2 — Điền MSSV, lớp</w:t>
+              <w:t xml:space="preserve">E — Điền MSSV, lớp</w:t>
             </w:r>
           </w:p>
         </w:tc>
@@ -3977,116 +3974,6 @@
                 <w:rStyle w:val="VerbatimChar"/>
               </w:rPr>
               <w:t xml:space="preserve">2713860</w:t>
-            </w:r>
-          </w:p>
-        </w:tc>
-      </w:tr>
-    </w:tbl>
-    <w:p>
-      <w:pPr>
-        <w:pStyle w:val="BodyText"/>
-      </w:pPr>
-      <w:r>
-        <w:t xml:space="preserve">Sau khi nộp TH1, phần sửa giao diện thuộc Milestone</w:t>
-      </w:r>
-      <w:r>
-        <w:t xml:space="preserve"> </w:t>
-      </w:r>
-      <w:r>
-        <w:rPr>
-          <w:rStyle w:val="VerbatimChar"/>
-        </w:rPr>
-        <w:t xml:space="preserve">TH2</w:t>
-      </w:r>
-      <w:r>
-        <w:t xml:space="preserve"> </w:t>
-      </w:r>
-      <w:r>
-        <w:t xml:space="preserve">và theo cùng quy trình:</w:t>
-      </w:r>
-    </w:p>
-    <w:tbl>
-      <w:tblPr>
-        <w:tblStyle w:val="Table"/>
-        <w:tblW w:type="pct" w:w="5000"/>
-        <w:tblLayout w:type="fixed"/>
-        <w:tblLook w:firstRow="1" w:lastRow="0" w:firstColumn="0" w:lastColumn="0" w:noHBand="0" w:noVBand="0" w:val="0020"/>
-      </w:tblPr>
-      <w:tblGrid>
-        <w:gridCol w:w="1320"/>
-        <w:gridCol w:w="1320"/>
-        <w:gridCol w:w="1320"/>
-        <w:gridCol w:w="1320"/>
-        <w:gridCol w:w="1320"/>
-        <w:gridCol w:w="1320"/>
-      </w:tblGrid>
-      <w:tr>
-        <w:trPr>
-          <w:tblHeader w:val="on"/>
-        </w:trPr>
-        <w:tc>
-          <w:tcPr/>
-          <w:p>
-            <w:pPr>
-              <w:pStyle w:val="Compact"/>
-            </w:pPr>
-            <w:r>
-              <w:t xml:space="preserve">Mục</w:t>
-            </w:r>
-          </w:p>
-        </w:tc>
-        <w:tc>
-          <w:tcPr/>
-          <w:p>
-            <w:pPr>
-              <w:pStyle w:val="Compact"/>
-            </w:pPr>
-            <w:r>
-              <w:t xml:space="preserve">Issue</w:t>
-            </w:r>
-          </w:p>
-        </w:tc>
-        <w:tc>
-          <w:tcPr/>
-          <w:p>
-            <w:pPr>
-              <w:pStyle w:val="Compact"/>
-            </w:pPr>
-            <w:r>
-              <w:t xml:space="preserve">Branch</w:t>
-            </w:r>
-          </w:p>
-        </w:tc>
-        <w:tc>
-          <w:tcPr/>
-          <w:p>
-            <w:pPr>
-              <w:pStyle w:val="Compact"/>
-            </w:pPr>
-            <w:r>
-              <w:t xml:space="preserve">PR</w:t>
-            </w:r>
-          </w:p>
-        </w:tc>
-        <w:tc>
-          <w:tcPr/>
-          <w:p>
-            <w:pPr>
-              <w:pStyle w:val="Compact"/>
-            </w:pPr>
-            <w:r>
-              <w:t xml:space="preserve">CI</w:t>
-            </w:r>
-          </w:p>
-        </w:tc>
-        <w:tc>
-          <w:tcPr/>
-          <w:p>
-            <w:pPr>
-              <w:pStyle w:val="Compact"/>
-            </w:pPr>
-            <w:r>
-              <w:t xml:space="preserve">Kết quả</w:t>
             </w:r>
           </w:p>
         </w:tc>
@@ -4099,7 +3986,7 @@
               <w:pStyle w:val="Compact"/>
             </w:pPr>
             <w:r>
-              <w:t xml:space="preserve">E — Sửa giao diện, dữ liệu demo</w:t>
+              <w:t xml:space="preserve">F — Sửa giao diện, dữ liệu demo (K6–K9)</w:t>
             </w:r>
           </w:p>
         </w:tc>
@@ -4167,6 +4054,77 @@
                 <w:rStyle w:val="VerbatimChar"/>
               </w:rPr>
               <w:t xml:space="preserve">bd06583</w:t>
+            </w:r>
+          </w:p>
+        </w:tc>
+      </w:tr>
+      <w:tr>
+        <w:tc>
+          <w:tcPr/>
+          <w:p>
+            <w:pPr>
+              <w:pStyle w:val="Compact"/>
+            </w:pPr>
+            <w:r>
+              <w:t xml:space="preserve">G — Cập nhật báo cáo</w:t>
+            </w:r>
+          </w:p>
+        </w:tc>
+        <w:tc>
+          <w:tcPr/>
+          <w:p>
+            <w:pPr>
+              <w:pStyle w:val="Compact"/>
+            </w:pPr>
+            <w:r>
+              <w:t xml:space="preserve">#19</w:t>
+            </w:r>
+          </w:p>
+        </w:tc>
+        <w:tc>
+          <w:tcPr/>
+          <w:p>
+            <w:pPr>
+              <w:pStyle w:val="Compact"/>
+            </w:pPr>
+            <w:r>
+              <w:rPr>
+                <w:rStyle w:val="VerbatimChar"/>
+              </w:rPr>
+              <w:t xml:space="preserve">docs/19-th1-report-ui</w:t>
+            </w:r>
+          </w:p>
+        </w:tc>
+        <w:tc>
+          <w:tcPr/>
+          <w:p>
+            <w:pPr>
+              <w:pStyle w:val="Compact"/>
+            </w:pPr>
+            <w:r>
+              <w:t xml:space="preserve">#20</w:t>
+            </w:r>
+          </w:p>
+        </w:tc>
+        <w:tc>
+          <w:tcPr/>
+          <w:p>
+            <w:pPr>
+              <w:pStyle w:val="Compact"/>
+            </w:pPr>
+            <w:r>
+              <w:t xml:space="preserve">chờ CI xanh rồi mới merge</w:t>
+            </w:r>
+          </w:p>
+        </w:tc>
+        <w:tc>
+          <w:tcPr/>
+          <w:p>
+            <w:pPr>
+              <w:pStyle w:val="Compact"/>
+            </w:pPr>
+            <w:r>
+              <w:t xml:space="preserve">PR cập nhật báo cáo này</w:t>
             </w:r>
           </w:p>
         </w:tc>
@@ -4202,7 +4160,7 @@
         <w:pStyle w:val="FirstParagraph"/>
       </w:pPr>
       <w:r>
-        <w:t xml:space="preserve">Hai lệnh dưới đây chạy ngày 16/10/2026 trên</w:t>
+        <w:t xml:space="preserve">Hai lệnh dưới đây chạy ngày 20/10/2026 trên</w:t>
       </w:r>
       <w:r>
         <w:t xml:space="preserve"> </w:t>
@@ -4214,7 +4172,19 @@
         <w:t xml:space="preserve">origin/main</w:t>
       </w:r>
       <w:r>
-        <w:t xml:space="preserve">,</w:t>
+        <w:t xml:space="preserve"> </w:t>
+      </w:r>
+      <w:r>
+        <w:t xml:space="preserve">(</w:t>
+      </w:r>
+      <w:r>
+        <w:rPr>
+          <w:rStyle w:val="VerbatimChar"/>
+        </w:rPr>
+        <w:t xml:space="preserve">bd06583</w:t>
+      </w:r>
+      <w:r>
+        <w:t xml:space="preserve">),</w:t>
       </w:r>
       <w:r>
         <w:t xml:space="preserve"> </w:t>
@@ -4224,7 +4194,7 @@
           <w:b/>
           <w:bCs/>
         </w:rPr>
-        <w:t xml:space="preserve">trước khi mở PR mục D</w:t>
+        <w:t xml:space="preserve">chạy trước khi merge PR #20</w:t>
       </w:r>
       <w:r>
         <w:t xml:space="preserve">:</w:t>
@@ -4238,7 +4208,7 @@
         <w:rPr>
           <w:rStyle w:val="VerbatimChar"/>
         </w:rPr>
-        <w:t xml:space="preserve">$ git log --first-parent --oneline course-baseline..main</w:t>
+        <w:t xml:space="preserve">$ git log --first-parent --oneline course-baseline..origin/main</w:t>
       </w:r>
       <w:r>
         <w:br/>
@@ -4247,6 +4217,33 @@
         <w:rPr>
           <w:rStyle w:val="VerbatimChar"/>
         </w:rPr>
+        <w:t xml:space="preserve">bd06583 Merge pull request #18 from HoangntDev/fix/17-ui-polish</w:t>
+      </w:r>
+      <w:r>
+        <w:br/>
+      </w:r>
+      <w:r>
+        <w:rPr>
+          <w:rStyle w:val="VerbatimChar"/>
+        </w:rPr>
+        <w:t xml:space="preserve">2713860 Merge pull request #16 from HoangntDev/docs/15-th1-thong-tin-sv</w:t>
+      </w:r>
+      <w:r>
+        <w:br/>
+      </w:r>
+      <w:r>
+        <w:rPr>
+          <w:rStyle w:val="VerbatimChar"/>
+        </w:rPr>
+        <w:t xml:space="preserve">6467a31 Merge pull request #14 from HoangntDev/docs/13-th1-report</w:t>
+      </w:r>
+      <w:r>
+        <w:br/>
+      </w:r>
+      <w:r>
+        <w:rPr>
+          <w:rStyle w:val="VerbatimChar"/>
+        </w:rPr>
         <w:t xml:space="preserve">8253341 Merge pull request #12 from HoangntDev/test/11-baseline-coverage</w:t>
       </w:r>
       <w:r>
@@ -4277,7 +4274,7 @@
         <w:rPr>
           <w:rStyle w:val="VerbatimChar"/>
         </w:rPr>
-        <w:t xml:space="preserve">$ git log --first-parent --no-merges --oneline course-baseline..main</w:t>
+        <w:t xml:space="preserve">$ git log --first-parent --no-merges --oneline course-baseline..origin/main</w:t>
       </w:r>
       <w:r>
         <w:br/>
@@ -4304,7 +4301,7 @@
           <w:b/>
           <w:bCs/>
         </w:rPr>
-        <w:t xml:space="preserve">trước khi merge PR #14</w:t>
+        <w:t xml:space="preserve">trước khi merge PR #20</w:t>
       </w:r>
       <w:r>
         <w:t xml:space="preserve"> </w:t>
@@ -4320,9 +4317,9 @@
       <w:r>
         <w:drawing>
           <wp:inline>
-            <wp:extent cx="5334000" cy="592335"/>
+            <wp:extent cx="5334000" cy="2760350"/>
             <wp:effectExtent b="0" l="0" r="0" t="0"/>
-            <wp:docPr descr="Hai lệnh git log trên origin/main trước khi merge PR #14" title="" id="27" name="Picture"/>
+            <wp:docPr descr="Hai lệnh git log trên origin/main trước khi merge PR #20" title="" id="27" name="Picture"/>
             <a:graphic>
               <a:graphicData uri="http://schemas.openxmlformats.org/drawingml/2006/picture">
                 <pic:pic>
@@ -4341,7 +4338,7 @@
                   <pic:spPr bwMode="auto">
                     <a:xfrm>
                       <a:off x="0" y="0"/>
-                      <a:ext cx="5334000" cy="592335"/>
+                      <a:ext cx="5334000" cy="2760350"/>
                     </a:xfrm>
                     <a:prstGeom prst="rect">
                       <a:avLst/>
@@ -4365,7 +4362,7 @@
         <w:pStyle w:val="ImageCaption"/>
       </w:pPr>
       <w:r>
-        <w:t xml:space="preserve">Hai lệnh git log trên origin/main trước khi merge PR #14</w:t>
+        <w:t xml:space="preserve">Hai lệnh git log trên origin/main trước khi merge PR #20</w:t>
       </w:r>
     </w:p>
     <w:p>
@@ -14404,7 +14401,7 @@
               <w:rPr>
                 <w:rStyle w:val="VerbatimChar"/>
               </w:rPr>
-              <w:t xml:space="preserve">docs/TH2/evidence/ui/README.md</w:t>
+              <w:t xml:space="preserve">docs/TH1/evidence/ui/README.md</w:t>
             </w:r>
           </w:p>
         </w:tc>
@@ -14651,7 +14648,7 @@
               <a:graphicData uri="http://schemas.openxmlformats.org/drawingml/2006/picture">
                 <pic:pic>
                   <pic:nvPicPr>
-                    <pic:cNvPr descr="../TH2/evidence/ui/truoc/dien-bieu-mau-desktop.png" id="84" name="Picture"/>
+                    <pic:cNvPr descr="evidence/ui/truoc/dien-bieu-mau-desktop.png" id="84" name="Picture"/>
                     <pic:cNvPicPr>
                       <a:picLocks noChangeArrowheads="1" noChangeAspect="1"/>
                     </pic:cNvPicPr>
@@ -14714,7 +14711,7 @@
               <a:graphicData uri="http://schemas.openxmlformats.org/drawingml/2006/picture">
                 <pic:pic>
                   <pic:nvPicPr>
-                    <pic:cNvPr descr="../TH2/evidence/ui/sau/dien-bieu-mau-desktop.png" id="87" name="Picture"/>
+                    <pic:cNvPr descr="evidence/ui/sau/dien-bieu-mau-desktop.png" id="87" name="Picture"/>
                     <pic:cNvPicPr>
                       <a:picLocks noChangeArrowheads="1" noChangeAspect="1"/>
                     </pic:cNvPicPr>
@@ -14777,7 +14774,7 @@
               <a:graphicData uri="http://schemas.openxmlformats.org/drawingml/2006/picture">
                 <pic:pic>
                   <pic:nvPicPr>
-                    <pic:cNvPr descr="../TH2/evidence/ui/truoc/trang-chu-sinh-vien-desktop.png" id="90" name="Picture"/>
+                    <pic:cNvPr descr="evidence/ui/truoc/trang-chu-sinh-vien-desktop.png" id="90" name="Picture"/>
                     <pic:cNvPicPr>
                       <a:picLocks noChangeArrowheads="1" noChangeAspect="1"/>
                     </pic:cNvPicPr>
@@ -14840,7 +14837,7 @@
               <a:graphicData uri="http://schemas.openxmlformats.org/drawingml/2006/picture">
                 <pic:pic>
                   <pic:nvPicPr>
-                    <pic:cNvPr descr="../TH2/evidence/ui/sau/trang-chu-sinh-vien-desktop.png" id="93" name="Picture"/>
+                    <pic:cNvPr descr="evidence/ui/sau/trang-chu-sinh-vien-desktop.png" id="93" name="Picture"/>
                     <pic:cNvPicPr>
                       <a:picLocks noChangeArrowheads="1" noChangeAspect="1"/>
                     </pic:cNvPicPr>
@@ -14947,7 +14944,7 @@
                     <a:graphicData uri="http://schemas.openxmlformats.org/drawingml/2006/picture">
                       <pic:pic>
                         <pic:nvPicPr>
-                          <pic:cNvPr descr="../TH2/evidence/ui/truoc/chuong-trinh-danh-sach-mobile.png" id="96" name="Picture"/>
+                          <pic:cNvPr descr="evidence/ui/truoc/chuong-trinh-danh-sach-mobile.png" id="96" name="Picture"/>
                           <pic:cNvPicPr>
                             <a:picLocks noChangeArrowheads="1" noChangeAspect="1"/>
                           </pic:cNvPicPr>
@@ -14998,7 +14995,7 @@
                     <a:graphicData uri="http://schemas.openxmlformats.org/drawingml/2006/picture">
                       <pic:pic>
                         <pic:nvPicPr>
-                          <pic:cNvPr descr="../TH2/evidence/ui/sau/chuong-trinh-danh-sach-mobile.png" id="99" name="Picture"/>
+                          <pic:cNvPr descr="evidence/ui/sau/chuong-trinh-danh-sach-mobile.png" id="99" name="Picture"/>
                           <pic:cNvPicPr>
                             <a:picLocks noChangeArrowheads="1" noChangeAspect="1"/>
                           </pic:cNvPicPr>
@@ -15327,7 +15324,7 @@
         <w:pStyle w:val="FirstParagraph"/>
       </w:pPr>
       <w:r>
-        <w:t xml:space="preserve">Sinh viên đọc lại báo cáo trước khi merge PR mục D.</w:t>
+        <w:t xml:space="preserve">Sinh viên đọc lại báo cáo trước khi merge PR #14 và PR #20.</w:t>
       </w:r>
     </w:p>
     <w:bookmarkEnd w:id="100"/>
@@ -15388,7 +15385,7 @@
         </w:numPr>
       </w:pPr>
       <w:r>
-        <w:t xml:space="preserve">Quy trình Git của môn đã áp dụng cho cả 4 mục của Milestone TH1.</w:t>
+        <w:t xml:space="preserve">Quy trình Git của môn đã áp dụng cho cả 7 PR của Milestone TH1 (#8, #10, #12, #14, #16, #18, #20).</w:t>
       </w:r>
       <w:r>
         <w:t xml:space="preserve"> </w:t>

</xml_diff>